<commit_message>
Agregar AGENTS.md y actualizar documentación y recursos del GDD
</commit_message>
<xml_diff>
--- a/docs/TF DT2 GDD.docx
+++ b/docs/TF DT2 GDD.docx
@@ -1,52 +1,51 @@
 
 <file path=word/document.xml><?xml version="1.0" encoding="utf-8"?>
-<w:document xmlns:mc="http://schemas.openxmlformats.org/markup-compatibility/2006" xmlns:o="urn:schemas-microsoft-com:office:office" xmlns:r="http://schemas.openxmlformats.org/officeDocument/2006/relationships" xmlns:m="http://schemas.openxmlformats.org/officeDocument/2006/math" xmlns:v="urn:schemas-microsoft-com:vml" xmlns:wp="http://schemas.openxmlformats.org/drawingml/2006/wordprocessingDrawing" xmlns:w10="urn:schemas-microsoft-com:office:word" xmlns:w="http://schemas.openxmlformats.org/wordprocessingml/2006/main" xmlns:wne="http://schemas.microsoft.com/office/word/2006/wordml" xmlns:sl="http://schemas.openxmlformats.org/schemaLibrary/2006/main" xmlns:a="http://schemas.openxmlformats.org/drawingml/2006/main" xmlns:pic="http://schemas.openxmlformats.org/drawingml/2006/picture" xmlns:c="http://schemas.openxmlformats.org/drawingml/2006/chart" xmlns:lc="http://schemas.openxmlformats.org/drawingml/2006/lockedCanvas" xmlns:dgm="http://schemas.openxmlformats.org/drawingml/2006/diagram" xmlns:wps="http://schemas.microsoft.com/office/word/2010/wordprocessingShape" xmlns:wpg="http://schemas.microsoft.com/office/word/2010/wordprocessingGroup" xmlns:w14="http://schemas.microsoft.com/office/word/2010/wordml" xmlns:w15="http://schemas.microsoft.com/office/word/2012/wordml" xmlns:w16="http://schemas.microsoft.com/office/word/2018/wordml" xmlns:w16cex="http://schemas.microsoft.com/office/word/2018/wordml/cex" xmlns:w16cid="http://schemas.microsoft.com/office/word/2016/wordml/cid" xmlns="http://schemas.microsoft.com/office/tasks/2019/documenttasks" xmlns:cr="http://schemas.microsoft.com/office/comments/2020/reactions">
+<w:document xmlns:wpc="http://schemas.microsoft.com/office/word/2010/wordprocessingCanvas" xmlns:cx="http://schemas.microsoft.com/office/drawing/2014/chartex" xmlns:cx1="http://schemas.microsoft.com/office/drawing/2015/9/8/chartex" xmlns:cx2="http://schemas.microsoft.com/office/drawing/2015/10/21/chartex" xmlns:cx3="http://schemas.microsoft.com/office/drawing/2016/5/9/chartex" xmlns:cx4="http://schemas.microsoft.com/office/drawing/2016/5/10/chartex" xmlns:cx5="http://schemas.microsoft.com/office/drawing/2016/5/11/chartex" xmlns:cx6="http://schemas.microsoft.com/office/drawing/2016/5/12/chartex" xmlns:cx7="http://schemas.microsoft.com/office/drawing/2016/5/13/chartex" xmlns:cx8="http://schemas.microsoft.com/office/drawing/2016/5/14/chartex" xmlns:mc="http://schemas.openxmlformats.org/markup-compatibility/2006" xmlns:aink="http://schemas.microsoft.com/office/drawing/2016/ink" xmlns:am3d="http://schemas.microsoft.com/office/drawing/2017/model3d" xmlns:o="urn:schemas-microsoft-com:office:office" xmlns:oel="http://schemas.microsoft.com/office/2019/extlst" xmlns:r="http://schemas.openxmlformats.org/officeDocument/2006/relationships" xmlns:m="http://schemas.openxmlformats.org/officeDocument/2006/math" xmlns:v="urn:schemas-microsoft-com:vml" xmlns:wp14="http://schemas.microsoft.com/office/word/2010/wordprocessingDrawing" xmlns:wp="http://schemas.openxmlformats.org/drawingml/2006/wordprocessingDrawing" xmlns:w10="urn:schemas-microsoft-com:office:word" xmlns:w="http://schemas.openxmlformats.org/wordprocessingml/2006/main" xmlns:w14="http://schemas.microsoft.com/office/word/2010/wordml" xmlns:w15="http://schemas.microsoft.com/office/word/2012/wordml" xmlns:w16cex="http://schemas.microsoft.com/office/word/2018/wordml/cex" xmlns:w16cid="http://schemas.microsoft.com/office/word/2016/wordml/cid" xmlns:w16="http://schemas.microsoft.com/office/word/2018/wordml" xmlns:w16sdtdh="http://schemas.microsoft.com/office/word/2020/wordml/sdtdatahash" xmlns:w16se="http://schemas.microsoft.com/office/word/2015/wordml/symex" xmlns:wpg="http://schemas.microsoft.com/office/word/2010/wordprocessingGroup" xmlns:wpi="http://schemas.microsoft.com/office/word/2010/wordprocessingInk" xmlns:wne="http://schemas.microsoft.com/office/word/2006/wordml" xmlns:wps="http://schemas.microsoft.com/office/word/2010/wordprocessingShape" mc:Ignorable="w14 w15 w16se w16cid w16 w16cex w16sdtdh wp14">
   <w:body>
     <w:p>
-      <w:pPr>
-        <w:rPr/>
-      </w:pPr>
-      <w:r>
-        <w:rPr>
-          <w:b w:val="1"/>
-          <w:bCs w:val="1"/>
-          <w:rtl w:val="0"/>
+      <w:r>
+        <w:rPr>
+          <w:b/>
+          <w:bCs/>
         </w:rPr>
         <w:t xml:space="preserve">Alumnos: </w:t>
       </w:r>
       <w:r>
-        <w:rPr>
-          <w:rtl w:val="0"/>
-        </w:rPr>
-        <w:t xml:space="preserve">Leno, Rocío Abril - Monutti Previderé, Margarita</w:t>
-      </w:r>
-    </w:p>
-    <w:p>
-      <w:pPr>
-        <w:rPr/>
-      </w:pPr>
-      <w:r>
-        <w:rPr>
-          <w:rtl w:val="0"/>
-        </w:rPr>
-      </w:r>
-    </w:p>
-    <w:p>
-      <w:pPr>
-        <w:rPr>
-          <w:b w:val="1"/>
-          <w:bCs w:val="1"/>
+        <w:t xml:space="preserve">Leno, Rocío Abril - </w:t>
+      </w:r>
+      <w:proofErr w:type="spellStart"/>
+      <w:r>
+        <w:t>Monutti</w:t>
+      </w:r>
+      <w:proofErr w:type="spellEnd"/>
+      <w:r>
+        <w:t xml:space="preserve"> </w:t>
+      </w:r>
+      <w:proofErr w:type="spellStart"/>
+      <w:r>
+        <w:t>Previderé</w:t>
+      </w:r>
+      <w:proofErr w:type="spellEnd"/>
+      <w:r>
+        <w:t>, Margarita</w:t>
+      </w:r>
+    </w:p>
+    <w:p/>
+    <w:p>
+      <w:pPr>
+        <w:rPr>
+          <w:b/>
+          <w:bCs/>
           <w:sz w:val="26"/>
           <w:szCs w:val="26"/>
         </w:rPr>
       </w:pPr>
       <w:r>
         <w:rPr>
-          <w:b w:val="1"/>
-          <w:bCs w:val="1"/>
+          <w:b/>
+          <w:bCs/>
           <w:sz w:val="26"/>
           <w:szCs w:val="26"/>
-          <w:rtl w:val="0"/>
         </w:rPr>
         <w:t xml:space="preserve">Mecánicas: </w:t>
       </w:r>
@@ -57,16 +56,9 @@
           <w:ilvl w:val="0"/>
           <w:numId w:val="1"/>
         </w:numPr>
-        <w:ind w:left="720" w:hanging="360"/>
-        <w:rPr>
-          <w:u w:val="none"/>
-        </w:rPr>
-      </w:pPr>
-      <w:r>
-        <w:rPr>
-          <w:rtl w:val="0"/>
-        </w:rPr>
-        <w:t xml:space="preserve">Movimiento en cuatro direcciones.</w:t>
+      </w:pPr>
+      <w:r>
+        <w:t>Movimiento en cuatro direcciones.</w:t>
       </w:r>
     </w:p>
     <w:p>
@@ -75,16 +67,9 @@
           <w:ilvl w:val="0"/>
           <w:numId w:val="1"/>
         </w:numPr>
-        <w:ind w:left="720" w:hanging="360"/>
-        <w:rPr>
-          <w:u w:val="none"/>
-        </w:rPr>
-      </w:pPr>
-      <w:r>
-        <w:rPr>
-          <w:rtl w:val="0"/>
-        </w:rPr>
-        <w:t xml:space="preserve">Disparar.</w:t>
+      </w:pPr>
+      <w:r>
+        <w:t>Disparar.</w:t>
       </w:r>
     </w:p>
     <w:p>
@@ -93,46 +78,29 @@
           <w:ilvl w:val="0"/>
           <w:numId w:val="1"/>
         </w:numPr>
-        <w:ind w:left="720" w:hanging="360"/>
-        <w:rPr>
-          <w:u w:val="none"/>
-        </w:rPr>
-      </w:pPr>
-      <w:r>
-        <w:rPr>
-          <w:rtl w:val="0"/>
-        </w:rPr>
-        <w:t xml:space="preserve">Consumir comida.</w:t>
-      </w:r>
-    </w:p>
-    <w:p>
-      <w:pPr>
-        <w:rPr/>
-      </w:pPr>
-      <w:r>
-        <w:rPr>
-          <w:rtl w:val="0"/>
-        </w:rPr>
-      </w:r>
-    </w:p>
-    <w:p>
-      <w:pPr>
-        <w:rPr>
-          <w:b w:val="1"/>
-          <w:bCs w:val="1"/>
+      </w:pPr>
+      <w:r>
+        <w:t>Consumir comida.</w:t>
+      </w:r>
+    </w:p>
+    <w:p/>
+    <w:p>
+      <w:pPr>
+        <w:rPr>
+          <w:b/>
+          <w:bCs/>
           <w:sz w:val="26"/>
           <w:szCs w:val="26"/>
         </w:rPr>
       </w:pPr>
       <w:r>
         <w:rPr>
-          <w:b w:val="1"/>
-          <w:bCs w:val="1"/>
+          <w:b/>
+          <w:bCs/>
           <w:sz w:val="26"/>
           <w:szCs w:val="26"/>
-          <w:rtl w:val="0"/>
-        </w:rPr>
-        <w:t xml:space="preserve">Controles:</w:t>
+        </w:rPr>
+        <w:t>Controles:</w:t>
       </w:r>
     </w:p>
     <w:p>
@@ -141,23 +109,15 @@
           <w:ilvl w:val="0"/>
           <w:numId w:val="5"/>
         </w:numPr>
-        <w:ind w:left="720" w:hanging="360"/>
-        <w:rPr>
-          <w:u w:val="none"/>
-        </w:rPr>
-      </w:pPr>
-      <w:r>
-        <w:rPr>
-          <w:b w:val="1"/>
-          <w:bCs w:val="1"/>
-          <w:rtl w:val="0"/>
-        </w:rPr>
-        <w:t xml:space="preserve">Arriba:</w:t>
-      </w:r>
-      <w:r>
-        <w:rPr>
-          <w:rtl w:val="0"/>
-        </w:rPr>
+      </w:pPr>
+      <w:r>
+        <w:rPr>
+          <w:b/>
+          <w:bCs/>
+        </w:rPr>
+        <w:t>Arriba:</w:t>
+      </w:r>
+      <w:r>
         <w:t xml:space="preserve"> W </w:t>
       </w:r>
     </w:p>
@@ -167,23 +127,15 @@
           <w:ilvl w:val="0"/>
           <w:numId w:val="5"/>
         </w:numPr>
-        <w:ind w:left="720" w:hanging="360"/>
-        <w:rPr>
-          <w:u w:val="none"/>
-        </w:rPr>
-      </w:pPr>
-      <w:r>
-        <w:rPr>
-          <w:b w:val="1"/>
-          <w:bCs w:val="1"/>
-          <w:rtl w:val="0"/>
-        </w:rPr>
-        <w:t xml:space="preserve">Abajo:</w:t>
-      </w:r>
-      <w:r>
-        <w:rPr>
-          <w:rtl w:val="0"/>
-        </w:rPr>
+      </w:pPr>
+      <w:r>
+        <w:rPr>
+          <w:b/>
+          <w:bCs/>
+        </w:rPr>
+        <w:t>Abajo:</w:t>
+      </w:r>
+      <w:r>
         <w:t xml:space="preserve"> S</w:t>
       </w:r>
     </w:p>
@@ -193,23 +145,15 @@
           <w:ilvl w:val="0"/>
           <w:numId w:val="5"/>
         </w:numPr>
-        <w:ind w:left="720" w:hanging="360"/>
-        <w:rPr>
-          <w:u w:val="none"/>
-        </w:rPr>
-      </w:pPr>
-      <w:r>
-        <w:rPr>
-          <w:b w:val="1"/>
-          <w:bCs w:val="1"/>
-          <w:rtl w:val="0"/>
-        </w:rPr>
-        <w:t xml:space="preserve">Derecha:</w:t>
-      </w:r>
-      <w:r>
-        <w:rPr>
-          <w:rtl w:val="0"/>
-        </w:rPr>
+      </w:pPr>
+      <w:r>
+        <w:rPr>
+          <w:b/>
+          <w:bCs/>
+        </w:rPr>
+        <w:t>Derecha:</w:t>
+      </w:r>
+      <w:r>
         <w:t xml:space="preserve"> D</w:t>
       </w:r>
     </w:p>
@@ -219,23 +163,15 @@
           <w:ilvl w:val="0"/>
           <w:numId w:val="5"/>
         </w:numPr>
-        <w:ind w:left="720" w:hanging="360"/>
-        <w:rPr>
-          <w:u w:val="none"/>
-        </w:rPr>
-      </w:pPr>
-      <w:r>
-        <w:rPr>
-          <w:b w:val="1"/>
-          <w:bCs w:val="1"/>
-          <w:rtl w:val="0"/>
-        </w:rPr>
-        <w:t xml:space="preserve">Izquierda:</w:t>
-      </w:r>
-      <w:r>
-        <w:rPr>
-          <w:rtl w:val="0"/>
-        </w:rPr>
+      </w:pPr>
+      <w:r>
+        <w:rPr>
+          <w:b/>
+          <w:bCs/>
+        </w:rPr>
+        <w:t>Izquierda:</w:t>
+      </w:r>
+      <w:r>
         <w:t xml:space="preserve"> A</w:t>
       </w:r>
     </w:p>
@@ -245,24 +181,24 @@
           <w:ilvl w:val="0"/>
           <w:numId w:val="5"/>
         </w:numPr>
-        <w:ind w:left="720" w:hanging="360"/>
-        <w:rPr>
-          <w:u w:val="none"/>
-        </w:rPr>
-      </w:pPr>
-      <w:r>
-        <w:rPr>
-          <w:b w:val="1"/>
-          <w:bCs w:val="1"/>
-          <w:rtl w:val="0"/>
-        </w:rPr>
-        <w:t xml:space="preserve">Disparar:</w:t>
-      </w:r>
-      <w:r>
-        <w:rPr>
-          <w:rtl w:val="0"/>
-        </w:rPr>
-        <w:t xml:space="preserve"> Click derecho</w:t>
+      </w:pPr>
+      <w:r>
+        <w:rPr>
+          <w:b/>
+          <w:bCs/>
+        </w:rPr>
+        <w:t>Disparar:</w:t>
+      </w:r>
+      <w:r>
+        <w:t xml:space="preserve"> </w:t>
+      </w:r>
+      <w:proofErr w:type="spellStart"/>
+      <w:r>
+        <w:t>Click</w:t>
+      </w:r>
+      <w:proofErr w:type="spellEnd"/>
+      <w:r>
+        <w:t xml:space="preserve"> derecho</w:t>
       </w:r>
     </w:p>
     <w:p>
@@ -271,38 +207,25 @@
           <w:ilvl w:val="0"/>
           <w:numId w:val="5"/>
         </w:numPr>
-        <w:ind w:left="720" w:hanging="360"/>
-        <w:rPr>
-          <w:u w:val="none"/>
-        </w:rPr>
-      </w:pPr>
-      <w:r>
-        <w:rPr>
-          <w:b w:val="1"/>
-          <w:bCs w:val="1"/>
-          <w:rtl w:val="0"/>
-        </w:rPr>
-        <w:t xml:space="preserve">Consumir comida:</w:t>
-      </w:r>
-      <w:r>
-        <w:rPr>
-          <w:rtl w:val="0"/>
-        </w:rPr>
+      </w:pPr>
+      <w:r>
+        <w:rPr>
+          <w:b/>
+          <w:bCs/>
+        </w:rPr>
+        <w:t>Consumir comida:</w:t>
+      </w:r>
+      <w:r>
         <w:t xml:space="preserve"> C</w:t>
       </w:r>
     </w:p>
     <w:p>
       <w:pPr>
         <w:rPr>
-          <w:b w:val="1"/>
-          <w:bCs w:val="1"/>
-        </w:rPr>
-      </w:pPr>
-      <w:r>
-        <w:rPr>
-          <w:rtl w:val="0"/>
-        </w:rPr>
-      </w:r>
+          <w:b/>
+          <w:bCs/>
+        </w:rPr>
+      </w:pPr>
     </w:p>
     <w:p>
       <w:pPr>
@@ -313,135 +236,95 @@
       </w:pPr>
       <w:r>
         <w:rPr>
-          <w:b w:val="1"/>
-          <w:bCs w:val="1"/>
+          <w:b/>
+          <w:bCs/>
           <w:sz w:val="26"/>
           <w:szCs w:val="26"/>
-          <w:rtl w:val="0"/>
-        </w:rPr>
-        <w:t xml:space="preserve">Concepto:</w:t>
+        </w:rPr>
+        <w:t>Concepto:</w:t>
       </w:r>
       <w:r>
         <w:rPr>
           <w:sz w:val="26"/>
           <w:szCs w:val="26"/>
-          <w:rtl w:val="0"/>
         </w:rPr>
         <w:t xml:space="preserve"> </w:t>
       </w:r>
     </w:p>
     <w:p>
-      <w:pPr>
-        <w:rPr/>
-      </w:pPr>
-      <w:r>
-        <w:rPr>
-          <w:rtl w:val="0"/>
-        </w:rPr>
-        <w:t xml:space="preserve">Juego topdown con disparos. Inspirado en el título de NES, Zombies Ate My Neighbours (1993).</w:t>
-      </w:r>
-    </w:p>
-    <w:p>
-      <w:pPr>
-        <w:rPr/>
-      </w:pPr>
-      <w:r>
-        <w:rPr>
-          <w:rtl w:val="0"/>
-        </w:rPr>
-      </w:r>
-    </w:p>
-    <w:p>
-      <w:pPr>
-        <w:rPr/>
-      </w:pPr>
-      <w:r>
-        <w:rPr>
-          <w:rtl w:val="0"/>
-        </w:rPr>
-      </w:r>
-    </w:p>
-    <w:p>
-      <w:pPr>
-        <w:rPr/>
-      </w:pPr>
-      <w:r>
-        <w:rPr>
-          <w:rtl w:val="0"/>
-        </w:rPr>
-        <w:t xml:space="preserve">El jugador se encuentra atrapado en un laberinto peligroso del cual debe escapar con los pocos recursos que tiene a su disposición: una ballesta para atacar y una bolsa con poca comida.</w:t>
-      </w:r>
-    </w:p>
-    <w:p>
-      <w:pPr>
-        <w:rPr/>
-      </w:pPr>
-      <w:r>
-        <w:rPr>
-          <w:rtl w:val="0"/>
-        </w:rPr>
-        <w:t xml:space="preserve">No puede escapar del laberinto solo dando vueltas, el jugador debe encontrar un total de tres llaves dispersas por el nivel. Las cuales son cada vez más difíciles de encontrar a medida que se avanza en cada nivel. Además, se encontrará con diferentes enemigos en cada nivel que le dificultarán</w:t>
-      </w:r>
-    </w:p>
-    <w:p>
-      <w:pPr>
-        <w:rPr/>
-      </w:pPr>
-      <w:r>
-        <w:rPr>
-          <w:rtl w:val="0"/>
-        </w:rPr>
-      </w:r>
-    </w:p>
-    <w:p>
-      <w:pPr>
-        <w:rPr/>
-      </w:pPr>
-      <w:r>
-        <w:rPr>
-          <w:rtl w:val="0"/>
-        </w:rPr>
-        <w:t xml:space="preserve">El jugador podrá, en ciertas ocasiones, saltar las paredes del laberinto para llegar a un lugar de difícil acceso. Esto solo es posible si en ambas partes de la pared se encuentra un hongo saltarín que ayude en esto.</w:t>
-      </w:r>
-    </w:p>
-    <w:p>
-      <w:pPr>
-        <w:rPr/>
-      </w:pPr>
-      <w:r>
-        <w:rPr>
-          <w:rtl w:val="0"/>
-        </w:rPr>
-      </w:r>
-    </w:p>
-    <w:p>
-      <w:pPr>
-        <w:rPr/>
-      </w:pPr>
-      <w:r>
-        <w:rPr>
-          <w:rtl w:val="0"/>
-        </w:rPr>
-      </w:r>
-    </w:p>
-    <w:p>
-      <w:pPr>
-        <w:rPr>
-          <w:b w:val="1"/>
-          <w:bCs w:val="1"/>
+      <w:r>
+        <w:t xml:space="preserve">Juego </w:t>
+      </w:r>
+      <w:proofErr w:type="spellStart"/>
+      <w:r>
+        <w:t>topdown</w:t>
+      </w:r>
+      <w:proofErr w:type="spellEnd"/>
+      <w:r>
+        <w:t xml:space="preserve"> con disparos. Inspirado en el título de NES, </w:t>
+      </w:r>
+      <w:proofErr w:type="spellStart"/>
+      <w:r>
+        <w:t>Zombies</w:t>
+      </w:r>
+      <w:proofErr w:type="spellEnd"/>
+      <w:r>
+        <w:t xml:space="preserve"> Ate </w:t>
+      </w:r>
+      <w:proofErr w:type="spellStart"/>
+      <w:r>
+        <w:t>My</w:t>
+      </w:r>
+      <w:proofErr w:type="spellEnd"/>
+      <w:r>
+        <w:t xml:space="preserve"> </w:t>
+      </w:r>
+      <w:proofErr w:type="spellStart"/>
+      <w:r>
+        <w:t>Neighbours</w:t>
+      </w:r>
+      <w:proofErr w:type="spellEnd"/>
+      <w:r>
+        <w:t xml:space="preserve"> (1993).</w:t>
+      </w:r>
+    </w:p>
+    <w:p/>
+    <w:p/>
+    <w:p>
+      <w:r>
+        <w:t>El jugador se encuentra atrapado en un laberinto peligroso del cual debe escapar con los pocos recursos que tiene a su disposición: una ballesta para atacar y una bolsa con poca comida.</w:t>
+      </w:r>
+    </w:p>
+    <w:p>
+      <w:r>
+        <w:t>No puede escapar del laberinto solo dando vueltas, el jugador debe encontrar un total de tres llaves dispersas por el nivel. Las cuales son cada vez más difíciles de encontrar a medida que se avanza en cada nivel. Además, se encontrará con diferentes enemigos en cada nivel que le dificultarán</w:t>
+      </w:r>
+    </w:p>
+    <w:p/>
+    <w:p>
+      <w:r>
+        <w:t>El jugador podrá, en ciertas ocasiones, saltar las paredes del laberinto para llegar a un lugar de difícil acceso. Esto solo es posible si en ambas partes de la pared se encuentra un hongo saltarín que ayude en esto.</w:t>
+      </w:r>
+    </w:p>
+    <w:p/>
+    <w:p/>
+    <w:p>
+      <w:pPr>
+        <w:rPr>
+          <w:b/>
+          <w:bCs/>
           <w:sz w:val="26"/>
           <w:szCs w:val="26"/>
         </w:rPr>
       </w:pPr>
       <w:r>
         <w:rPr>
-          <w:b w:val="1"/>
-          <w:bCs w:val="1"/>
+          <w:b/>
+          <w:bCs/>
           <w:sz w:val="26"/>
           <w:szCs w:val="26"/>
-          <w:rtl w:val="0"/>
-        </w:rPr>
-        <w:t xml:space="preserve">Jugador:</w:t>
+        </w:rPr>
+        <w:t>Jugador:</w:t>
       </w:r>
     </w:p>
     <w:p>
@@ -450,16 +333,9 @@
           <w:ilvl w:val="0"/>
           <w:numId w:val="2"/>
         </w:numPr>
-        <w:ind w:left="720" w:hanging="360"/>
-        <w:rPr>
-          <w:u w:val="none"/>
-        </w:rPr>
-      </w:pPr>
-      <w:r>
-        <w:rPr>
-          <w:rtl w:val="0"/>
-        </w:rPr>
-        <w:t xml:space="preserve">Barra de vida de 3 corazones, puede aumentar si se encuentra el objeto necesario.</w:t>
+      </w:pPr>
+      <w:r>
+        <w:t>Barra de vida de 3 corazones, puede aumentar si se encuentra el objeto necesario.</w:t>
       </w:r>
     </w:p>
     <w:p>
@@ -468,46 +344,29 @@
           <w:ilvl w:val="0"/>
           <w:numId w:val="2"/>
         </w:numPr>
-        <w:ind w:left="720" w:hanging="360"/>
-        <w:rPr>
-          <w:u w:val="none"/>
-        </w:rPr>
-      </w:pPr>
-      <w:r>
-        <w:rPr>
-          <w:rtl w:val="0"/>
-        </w:rPr>
-        <w:t xml:space="preserve">Ballesta con una munición de 20 flechas que se pueden equipar en un momento, se puede recargar.</w:t>
-      </w:r>
-    </w:p>
-    <w:p>
-      <w:pPr>
-        <w:rPr/>
-      </w:pPr>
-      <w:r>
-        <w:rPr>
-          <w:rtl w:val="0"/>
-        </w:rPr>
-      </w:r>
-    </w:p>
-    <w:p>
-      <w:pPr>
-        <w:rPr>
-          <w:b w:val="1"/>
-          <w:bCs w:val="1"/>
+      </w:pPr>
+      <w:r>
+        <w:t>Ballesta con una munición de 20 flechas que se pueden equipar en un momento, se puede recargar.</w:t>
+      </w:r>
+    </w:p>
+    <w:p/>
+    <w:p>
+      <w:pPr>
+        <w:rPr>
+          <w:b/>
+          <w:bCs/>
           <w:sz w:val="26"/>
           <w:szCs w:val="26"/>
         </w:rPr>
       </w:pPr>
       <w:r>
         <w:rPr>
-          <w:b w:val="1"/>
-          <w:bCs w:val="1"/>
+          <w:b/>
+          <w:bCs/>
           <w:sz w:val="26"/>
           <w:szCs w:val="26"/>
-          <w:rtl w:val="0"/>
-        </w:rPr>
-        <w:t xml:space="preserve">Enemigos:</w:t>
+        </w:rPr>
+        <w:t>Enemigos:</w:t>
       </w:r>
     </w:p>
     <w:p>
@@ -516,31 +375,15 @@
           <w:ilvl w:val="0"/>
           <w:numId w:val="3"/>
         </w:numPr>
-        <w:ind w:left="720" w:hanging="360"/>
-        <w:rPr>
-          <w:u w:val="none"/>
-        </w:rPr>
-      </w:pPr>
-      <w:r>
-        <w:rPr>
-          <w:b w:val="1"/>
-          <w:bCs w:val="1"/>
-          <w:rtl w:val="0"/>
-        </w:rPr>
-        <w:t xml:space="preserve">Elfo - Enemigo 1</w:t>
-      </w:r>
-      <w:r>
-        <w:rPr>
-          <w:b w:val="1"/>
-          <w:bCs w:val="1"/>
-          <w:rtl w:val="0"/>
-        </w:rPr>
-        <w:t xml:space="preserve">:</w:t>
-      </w:r>
-      <w:r>
-        <w:rPr>
-          <w:rtl w:val="0"/>
-        </w:rPr>
+      </w:pPr>
+      <w:r>
+        <w:rPr>
+          <w:b/>
+          <w:bCs/>
+        </w:rPr>
+        <w:t>Elfo - Enemigo 1:</w:t>
+      </w:r>
+      <w:r>
         <w:t xml:space="preserve"> el más común de encontrar, persiguen al jugador si este se acerca mucho a su línea de visión. Mueren de un solo disparo con la ballesta. Aunque sean fáciles de eliminar y sean lentos, aparecen en grupos.</w:t>
       </w:r>
     </w:p>
@@ -550,23 +393,38 @@
           <w:ilvl w:val="0"/>
           <w:numId w:val="3"/>
         </w:numPr>
-        <w:ind w:left="720" w:hanging="360"/>
-        <w:rPr>
-          <w:u w:val="none"/>
-        </w:rPr>
-      </w:pPr>
-      <w:r>
-        <w:rPr>
-          <w:b w:val="1"/>
-          <w:bCs w:val="1"/>
-          <w:rtl w:val="0"/>
-        </w:rPr>
-        <w:t xml:space="preserve">Enemigo 2:</w:t>
-      </w:r>
-      <w:r>
-        <w:rPr>
-          <w:rtl w:val="0"/>
-        </w:rPr>
+      </w:pPr>
+      <w:r>
+        <w:rPr>
+          <w:b/>
+          <w:bCs/>
+        </w:rPr>
+        <w:t>Enemigo 2</w:t>
+      </w:r>
+      <w:r>
+        <w:rPr>
+          <w:b/>
+          <w:bCs/>
+        </w:rPr>
+        <w:t xml:space="preserve"> - </w:t>
+      </w:r>
+      <w:proofErr w:type="spellStart"/>
+      <w:r>
+        <w:rPr>
+          <w:b/>
+          <w:bCs/>
+        </w:rPr>
+        <w:t>Zombie</w:t>
+      </w:r>
+      <w:proofErr w:type="spellEnd"/>
+      <w:r>
+        <w:rPr>
+          <w:b/>
+          <w:bCs/>
+        </w:rPr>
+        <w:t>:</w:t>
+      </w:r>
+      <w:r>
         <w:t xml:space="preserve"> Mucho más fuertes y aparecen con menos frecuencia. Mueren de cinco disparos, aparecen en grupos de entre 1 a 3.</w:t>
       </w:r>
     </w:p>
@@ -576,86 +434,48 @@
           <w:ilvl w:val="0"/>
           <w:numId w:val="3"/>
         </w:numPr>
-        <w:ind w:left="720" w:hanging="360"/>
-        <w:rPr>
-          <w:b w:val="1"/>
-          <w:bCs w:val="1"/>
-        </w:rPr>
-      </w:pPr>
-      <w:r>
-        <w:rPr>
-          <w:b w:val="1"/>
-          <w:bCs w:val="1"/>
-          <w:rtl w:val="0"/>
+        <w:rPr>
+          <w:b/>
+          <w:bCs/>
+        </w:rPr>
+      </w:pPr>
+      <w:r>
+        <w:rPr>
+          <w:b/>
+          <w:bCs/>
         </w:rPr>
         <w:t xml:space="preserve">Ogro - Enemigo 3: </w:t>
       </w:r>
       <w:r>
-        <w:rPr>
-          <w:rtl w:val="0"/>
-        </w:rPr>
-        <w:t xml:space="preserve">Un tipo de jefe que aparece a partir del nivel 3 del juego.</w:t>
-      </w:r>
-    </w:p>
-    <w:p>
-      <w:pPr>
-        <w:rPr/>
-      </w:pPr>
-      <w:r>
-        <w:rPr>
-          <w:rtl w:val="0"/>
-        </w:rPr>
-      </w:r>
-    </w:p>
-    <w:p>
-      <w:pPr>
-        <w:rPr/>
-      </w:pPr>
-      <w:r>
-        <w:rPr>
-          <w:rtl w:val="0"/>
-        </w:rPr>
-      </w:r>
-    </w:p>
-    <w:p>
-      <w:pPr>
-        <w:rPr/>
-      </w:pPr>
-      <w:r>
-        <w:rPr>
-          <w:rtl w:val="0"/>
-        </w:rPr>
-        <w:t xml:space="preserve">En cada nivel se podrán encontrar cofres que el jugador puede abrir, en este caso se le dan diferentes recompensas aleatorias.</w:t>
-      </w:r>
-    </w:p>
-    <w:p>
-      <w:pPr>
-        <w:rPr/>
-      </w:pPr>
-      <w:r>
-        <w:rPr>
-          <w:rtl w:val="0"/>
-        </w:rPr>
-      </w:r>
-    </w:p>
-    <w:p>
-      <w:pPr>
-        <w:rPr>
-          <w:b w:val="1"/>
-          <w:bCs w:val="1"/>
+        <w:t>Un tipo de jefe que aparece a partir del nivel 3 del juego.</w:t>
+      </w:r>
+    </w:p>
+    <w:p/>
+    <w:p/>
+    <w:p>
+      <w:r>
+        <w:lastRenderedPageBreak/>
+        <w:t>En cada nivel se podrán encontrar cofres que el jugador puede abrir, en este caso se le dan diferentes recompensas aleatorias.</w:t>
+      </w:r>
+    </w:p>
+    <w:p/>
+    <w:p>
+      <w:pPr>
+        <w:rPr>
+          <w:b/>
+          <w:bCs/>
           <w:sz w:val="26"/>
           <w:szCs w:val="26"/>
         </w:rPr>
       </w:pPr>
       <w:r>
         <w:rPr>
-          <w:b w:val="1"/>
-          <w:bCs w:val="1"/>
+          <w:b/>
+          <w:bCs/>
           <w:sz w:val="26"/>
           <w:szCs w:val="26"/>
-          <w:rtl w:val="0"/>
-        </w:rPr>
-        <w:t xml:space="preserve">Objetos en cofres:</w:t>
+        </w:rPr>
+        <w:t>Objetos en cofres:</w:t>
       </w:r>
     </w:p>
     <w:p>
@@ -664,20 +484,15 @@
           <w:ilvl w:val="0"/>
           <w:numId w:val="4"/>
         </w:numPr>
-        <w:ind w:left="720" w:hanging="360"/>
-      </w:pPr>
-      <w:r>
-        <w:rPr>
-          <w:b w:val="1"/>
-          <w:bCs w:val="1"/>
-          <w:rtl w:val="0"/>
-        </w:rPr>
-        <w:t xml:space="preserve">Tesoro:</w:t>
-      </w:r>
-      <w:r>
-        <w:rPr>
-          <w:rtl w:val="0"/>
-        </w:rPr>
+      </w:pPr>
+      <w:r>
+        <w:rPr>
+          <w:b/>
+          <w:bCs/>
+        </w:rPr>
+        <w:t>Tesoro:</w:t>
+      </w:r>
+      <w:r>
         <w:t xml:space="preserve"> Un objeto que da entre 10 y 100 puntos.</w:t>
       </w:r>
     </w:p>
@@ -687,20 +502,15 @@
           <w:ilvl w:val="0"/>
           <w:numId w:val="4"/>
         </w:numPr>
-        <w:ind w:left="720" w:hanging="360"/>
-      </w:pPr>
-      <w:r>
-        <w:rPr>
-          <w:b w:val="1"/>
-          <w:bCs w:val="1"/>
-          <w:rtl w:val="0"/>
-        </w:rPr>
-        <w:t xml:space="preserve">Manzana:</w:t>
-      </w:r>
-      <w:r>
-        <w:rPr>
-          <w:rtl w:val="0"/>
-        </w:rPr>
+      </w:pPr>
+      <w:r>
+        <w:rPr>
+          <w:b/>
+          <w:bCs/>
+        </w:rPr>
+        <w:t>Manzana:</w:t>
+      </w:r>
+      <w:r>
         <w:t xml:space="preserve"> Restaura un corazón de vida.</w:t>
       </w:r>
     </w:p>
@@ -710,26 +520,16 @@
           <w:ilvl w:val="0"/>
           <w:numId w:val="4"/>
         </w:numPr>
-        <w:ind w:left="720" w:hanging="360"/>
-      </w:pPr>
-      <w:r>
-        <w:rPr>
-          <w:b w:val="1"/>
-          <w:bCs w:val="1"/>
-          <w:rtl w:val="0"/>
-        </w:rPr>
-        <w:t xml:space="preserve">Munición de flechas:</w:t>
-      </w:r>
-      <w:r>
-        <w:rPr>
-          <w:rtl w:val="0"/>
-        </w:rPr>
+      </w:pPr>
+      <w:r>
+        <w:rPr>
+          <w:b/>
+          <w:bCs/>
+        </w:rPr>
+        <w:t>Munición de flechas:</w:t>
+      </w:r>
+      <w:r>
         <w:t xml:space="preserve"> Se encuentran un máximo de 5 por cofre.</w:t>
-      </w:r>
-      <w:r>
-        <w:rPr>
-          <w:rtl w:val="0"/>
-        </w:rPr>
       </w:r>
     </w:p>
     <w:p>
@@ -738,68 +538,37 @@
           <w:ilvl w:val="0"/>
           <w:numId w:val="4"/>
         </w:numPr>
-        <w:ind w:left="720" w:hanging="360"/>
-        <w:rPr>
-          <w:u w:val="none"/>
-        </w:rPr>
-      </w:pPr>
-      <w:r>
-        <w:rPr>
-          <w:b w:val="1"/>
-          <w:bCs w:val="1"/>
-          <w:rtl w:val="0"/>
-        </w:rPr>
-        <w:t xml:space="preserve">Hada:</w:t>
-      </w:r>
-      <w:r>
-        <w:rPr>
-          <w:rtl w:val="0"/>
-        </w:rPr>
+      </w:pPr>
+      <w:r>
+        <w:rPr>
+          <w:b/>
+          <w:bCs/>
+        </w:rPr>
+        <w:t>Hada:</w:t>
+      </w:r>
+      <w:r>
         <w:t xml:space="preserve"> Al liberarla, indicará la dirección de las llaves restantes. Si el jugador tiene las tres llaves, indicará donde está la puerta del siguiente nivel.</w:t>
       </w:r>
     </w:p>
-    <w:p>
-      <w:pPr>
-        <w:rPr/>
-      </w:pPr>
-      <w:r>
-        <w:rPr>
-          <w:rtl w:val="0"/>
-        </w:rPr>
-      </w:r>
-    </w:p>
-    <w:p>
-      <w:pPr>
-        <w:rPr/>
-      </w:pPr>
-      <w:r>
-        <w:rPr>
-          <w:rtl w:val="0"/>
-        </w:rPr>
-      </w:r>
-    </w:p>
-    <w:p>
-      <w:pPr>
-        <w:rPr/>
-      </w:pPr>
-      <w:r>
-        <w:rPr>
-          <w:rtl w:val="0"/>
-        </w:rPr>
-      </w:r>
-    </w:p>
+    <w:p/>
+    <w:p/>
+    <w:p/>
     <w:sectPr>
-      <w:pgSz w:h="16834" w:w="11909" w:orient="portrait"/>
-      <w:pgMar w:bottom="1440" w:top="1440" w:left="1440" w:right="1440" w:header="720" w:footer="720"/>
+      <w:pgSz w:w="11909" w:h="16834"/>
+      <w:pgMar w:top="1440" w:right="1440" w:bottom="1440" w:left="1440" w:header="720" w:footer="720" w:gutter="0"/>
       <w:pgNumType w:start="1"/>
+      <w:cols w:space="720"/>
     </w:sectPr>
   </w:body>
 </w:document>
 </file>
 
 <file path=word/numbering.xml><?xml version="1.0" encoding="utf-8"?>
-<w:numbering xmlns:mc="http://schemas.openxmlformats.org/markup-compatibility/2006" xmlns:o="urn:schemas-microsoft-com:office:office" xmlns:r="http://schemas.openxmlformats.org/officeDocument/2006/relationships" xmlns:m="http://schemas.openxmlformats.org/officeDocument/2006/math" xmlns:v="urn:schemas-microsoft-com:vml" xmlns:wp="http://schemas.openxmlformats.org/drawingml/2006/wordprocessingDrawing" xmlns:w10="urn:schemas-microsoft-com:office:word" xmlns:w="http://schemas.openxmlformats.org/wordprocessingml/2006/main" xmlns:wne="http://schemas.microsoft.com/office/word/2006/wordml" xmlns:sl="http://schemas.openxmlformats.org/schemaLibrary/2006/main" xmlns:a="http://schemas.openxmlformats.org/drawingml/2006/main" xmlns:pic="http://schemas.openxmlformats.org/drawingml/2006/picture" xmlns:c="http://schemas.openxmlformats.org/drawingml/2006/chart" xmlns:lc="http://schemas.openxmlformats.org/drawingml/2006/lockedCanvas" xmlns:dgm="http://schemas.openxmlformats.org/drawingml/2006/diagram" xmlns:wps="http://schemas.microsoft.com/office/word/2010/wordprocessingShape" xmlns:wpg="http://schemas.microsoft.com/office/word/2010/wordprocessingGroup" xmlns:w14="http://schemas.microsoft.com/office/word/2010/wordml" xmlns:w15="http://schemas.microsoft.com/office/word/2012/wordml" xmlns:w16="http://schemas.microsoft.com/office/word/2018/wordml" xmlns:w16cex="http://schemas.microsoft.com/office/word/2018/wordml/cex" xmlns:w16cid="http://schemas.microsoft.com/office/word/2016/wordml/cid" xmlns="http://schemas.microsoft.com/office/tasks/2019/documenttasks" xmlns:cr="http://schemas.microsoft.com/office/comments/2020/reactions">
-  <w:abstractNum w:abstractNumId="1">
+<w:numbering xmlns:wpc="http://schemas.microsoft.com/office/word/2010/wordprocessingCanvas" xmlns:cx="http://schemas.microsoft.com/office/drawing/2014/chartex" xmlns:cx1="http://schemas.microsoft.com/office/drawing/2015/9/8/chartex" xmlns:cx2="http://schemas.microsoft.com/office/drawing/2015/10/21/chartex" xmlns:cx3="http://schemas.microsoft.com/office/drawing/2016/5/9/chartex" xmlns:cx4="http://schemas.microsoft.com/office/drawing/2016/5/10/chartex" xmlns:cx5="http://schemas.microsoft.com/office/drawing/2016/5/11/chartex" xmlns:cx6="http://schemas.microsoft.com/office/drawing/2016/5/12/chartex" xmlns:cx7="http://schemas.microsoft.com/office/drawing/2016/5/13/chartex" xmlns:cx8="http://schemas.microsoft.com/office/drawing/2016/5/14/chartex" xmlns:mc="http://schemas.openxmlformats.org/markup-compatibility/2006" xmlns:aink="http://schemas.microsoft.com/office/drawing/2016/ink" xmlns:am3d="http://schemas.microsoft.com/office/drawing/2017/model3d" xmlns:o="urn:schemas-microsoft-com:office:office" xmlns:oel="http://schemas.microsoft.com/office/2019/extlst" xmlns:r="http://schemas.openxmlformats.org/officeDocument/2006/relationships" xmlns:m="http://schemas.openxmlformats.org/officeDocument/2006/math" xmlns:v="urn:schemas-microsoft-com:vml" xmlns:wp14="http://schemas.microsoft.com/office/word/2010/wordprocessingDrawing" xmlns:wp="http://schemas.openxmlformats.org/drawingml/2006/wordprocessingDrawing" xmlns:w10="urn:schemas-microsoft-com:office:word" xmlns:w="http://schemas.openxmlformats.org/wordprocessingml/2006/main" xmlns:w14="http://schemas.microsoft.com/office/word/2010/wordml" xmlns:w15="http://schemas.microsoft.com/office/word/2012/wordml" xmlns:w16cex="http://schemas.microsoft.com/office/word/2018/wordml/cex" xmlns:w16cid="http://schemas.microsoft.com/office/word/2016/wordml/cid" xmlns:w16="http://schemas.microsoft.com/office/word/2018/wordml" xmlns:w16sdtdh="http://schemas.microsoft.com/office/word/2020/wordml/sdtdatahash" xmlns:w16se="http://schemas.microsoft.com/office/word/2015/wordml/symex" xmlns:wpg="http://schemas.microsoft.com/office/word/2010/wordprocessingGroup" xmlns:wpi="http://schemas.microsoft.com/office/word/2010/wordprocessingInk" xmlns:wne="http://schemas.microsoft.com/office/word/2006/wordml" xmlns:wps="http://schemas.microsoft.com/office/word/2010/wordprocessingShape" mc:Ignorable="w14 w15 w16se w16cid w16 w16cex w16sdtdh wp14">
+  <w:abstractNum w:abstractNumId="0" w15:restartNumberingAfterBreak="0">
+    <w:nsid w:val="05FC53EC"/>
+    <w:multiLevelType w:val="multilevel"/>
+    <w:tmpl w:val="8AB4B002"/>
     <w:lvl w:ilvl="0">
       <w:start w:val="1"/>
       <w:numFmt w:val="bullet"/>
@@ -909,7 +678,10 @@
       </w:rPr>
     </w:lvl>
   </w:abstractNum>
-  <w:abstractNum w:abstractNumId="2">
+  <w:abstractNum w:abstractNumId="1" w15:restartNumberingAfterBreak="0">
+    <w:nsid w:val="15B461B2"/>
+    <w:multiLevelType w:val="multilevel"/>
+    <w:tmpl w:val="4EF68610"/>
     <w:lvl w:ilvl="0">
       <w:start w:val="1"/>
       <w:numFmt w:val="bullet"/>
@@ -1019,7 +791,10 @@
       </w:rPr>
     </w:lvl>
   </w:abstractNum>
-  <w:abstractNum w:abstractNumId="3">
+  <w:abstractNum w:abstractNumId="2" w15:restartNumberingAfterBreak="0">
+    <w:nsid w:val="1A9B6DA7"/>
+    <w:multiLevelType w:val="multilevel"/>
+    <w:tmpl w:val="C74C2518"/>
     <w:lvl w:ilvl="0">
       <w:start w:val="1"/>
       <w:numFmt w:val="bullet"/>
@@ -1129,7 +904,10 @@
       </w:rPr>
     </w:lvl>
   </w:abstractNum>
-  <w:abstractNum w:abstractNumId="4">
+  <w:abstractNum w:abstractNumId="3" w15:restartNumberingAfterBreak="0">
+    <w:nsid w:val="4CAD4817"/>
+    <w:multiLevelType w:val="multilevel"/>
+    <w:tmpl w:val="CAB4F9C0"/>
     <w:lvl w:ilvl="0">
       <w:start w:val="1"/>
       <w:numFmt w:val="bullet"/>
@@ -1239,7 +1017,10 @@
       </w:rPr>
     </w:lvl>
   </w:abstractNum>
-  <w:abstractNum w:abstractNumId="5">
+  <w:abstractNum w:abstractNumId="4" w15:restartNumberingAfterBreak="0">
+    <w:nsid w:val="64A679B0"/>
+    <w:multiLevelType w:val="multilevel"/>
+    <w:tmpl w:val="32A2B8C0"/>
     <w:lvl w:ilvl="0">
       <w:start w:val="1"/>
       <w:numFmt w:val="bullet"/>
@@ -1349,33 +1130,33 @@
       </w:rPr>
     </w:lvl>
   </w:abstractNum>
-  <w:num w:numId="1">
-    <w:abstractNumId w:val="1"/>
+  <w:num w:numId="1" w16cid:durableId="2102027952">
+    <w:abstractNumId w:val="3"/>
   </w:num>
-  <w:num w:numId="2">
+  <w:num w:numId="2" w16cid:durableId="772827540">
     <w:abstractNumId w:val="2"/>
   </w:num>
-  <w:num w:numId="3">
-    <w:abstractNumId w:val="3"/>
-  </w:num>
-  <w:num w:numId="4">
+  <w:num w:numId="3" w16cid:durableId="9112071">
     <w:abstractNumId w:val="4"/>
   </w:num>
-  <w:num w:numId="5">
-    <w:abstractNumId w:val="5"/>
+  <w:num w:numId="4" w16cid:durableId="1614897007">
+    <w:abstractNumId w:val="0"/>
+  </w:num>
+  <w:num w:numId="5" w16cid:durableId="195436122">
+    <w:abstractNumId w:val="1"/>
   </w:num>
 </w:numbering>
 </file>
 
 <file path=word/styles.xml><?xml version="1.0" encoding="utf-8"?>
-<w:styles xmlns:mc="http://schemas.openxmlformats.org/markup-compatibility/2006" xmlns:o="urn:schemas-microsoft-com:office:office" xmlns:r="http://schemas.openxmlformats.org/officeDocument/2006/relationships" xmlns:m="http://schemas.openxmlformats.org/officeDocument/2006/math" xmlns:v="urn:schemas-microsoft-com:vml" xmlns:wp="http://schemas.openxmlformats.org/drawingml/2006/wordprocessingDrawing" xmlns:w10="urn:schemas-microsoft-com:office:word" xmlns:w="http://schemas.openxmlformats.org/wordprocessingml/2006/main" xmlns:wne="http://schemas.microsoft.com/office/word/2006/wordml" xmlns:sl="http://schemas.openxmlformats.org/schemaLibrary/2006/main" xmlns:a="http://schemas.openxmlformats.org/drawingml/2006/main" xmlns:pic="http://schemas.openxmlformats.org/drawingml/2006/picture" xmlns:c="http://schemas.openxmlformats.org/drawingml/2006/chart" xmlns:lc="http://schemas.openxmlformats.org/drawingml/2006/lockedCanvas" xmlns:dgm="http://schemas.openxmlformats.org/drawingml/2006/diagram" xmlns:wps="http://schemas.microsoft.com/office/word/2010/wordprocessingShape" xmlns:wpg="http://schemas.microsoft.com/office/word/2010/wordprocessingGroup" xmlns:w14="http://schemas.microsoft.com/office/word/2010/wordml" xmlns:w15="http://schemas.microsoft.com/office/word/2012/wordml" xmlns:w16="http://schemas.microsoft.com/office/word/2018/wordml" xmlns:w16cex="http://schemas.microsoft.com/office/word/2018/wordml/cex" xmlns:w16cid="http://schemas.microsoft.com/office/word/2016/wordml/cid" xmlns="http://schemas.microsoft.com/office/tasks/2019/documenttasks" xmlns:cr="http://schemas.microsoft.com/office/comments/2020/reactions">
+<w:styles xmlns:mc="http://schemas.openxmlformats.org/markup-compatibility/2006" xmlns:r="http://schemas.openxmlformats.org/officeDocument/2006/relationships" xmlns:w="http://schemas.openxmlformats.org/wordprocessingml/2006/main" xmlns:w14="http://schemas.microsoft.com/office/word/2010/wordml" xmlns:w15="http://schemas.microsoft.com/office/word/2012/wordml" xmlns:w16cex="http://schemas.microsoft.com/office/word/2018/wordml/cex" xmlns:w16cid="http://schemas.microsoft.com/office/word/2016/wordml/cid" xmlns:w16="http://schemas.microsoft.com/office/word/2018/wordml" xmlns:w16sdtdh="http://schemas.microsoft.com/office/word/2020/wordml/sdtdatahash" xmlns:w16se="http://schemas.microsoft.com/office/word/2015/wordml/symex" mc:Ignorable="w14 w15 w16se w16cid w16 w16cex w16sdtdh">
   <w:docDefaults>
     <w:rPrDefault>
       <w:rPr>
-        <w:rFonts w:ascii="Arial" w:cs="Arial" w:eastAsia="Arial" w:hAnsi="Arial"/>
+        <w:rFonts w:ascii="Arial" w:eastAsia="Arial" w:hAnsi="Arial" w:cs="Arial"/>
         <w:sz w:val="22"/>
         <w:szCs w:val="22"/>
-        <w:lang w:val="es_419"/>
+        <w:lang w:val="es-419" w:eastAsia="es-AR" w:bidi="ar-SA"/>
       </w:rPr>
     </w:rPrDefault>
     <w:pPrDefault>
@@ -1384,79 +1165,457 @@
       </w:pPr>
     </w:pPrDefault>
   </w:docDefaults>
-  <w:style w:type="table" w:styleId="TableNormal" w:default="1">
-    <w:name w:val="TableNormal"/>
-    <w:tblPr>
-      <w:tblCellMar>
-        <w:top w:w="100.0" w:type="dxa"/>
-        <w:left w:w="100.0" w:type="dxa"/>
-        <w:bottom w:w="100.0" w:type="dxa"/>
-        <w:right w:w="100.0" w:type="dxa"/>
-      </w:tblCellMar>
-    </w:tblPr>
+  <w:latentStyles w:defLockedState="0" w:defUIPriority="99" w:defSemiHidden="0" w:defUnhideWhenUsed="0" w:defQFormat="0" w:count="376">
+    <w:lsdException w:name="Normal" w:uiPriority="0" w:qFormat="1"/>
+    <w:lsdException w:name="heading 1" w:uiPriority="9" w:qFormat="1"/>
+    <w:lsdException w:name="heading 2" w:semiHidden="1" w:uiPriority="9" w:unhideWhenUsed="1" w:qFormat="1"/>
+    <w:lsdException w:name="heading 3" w:semiHidden="1" w:uiPriority="9" w:unhideWhenUsed="1" w:qFormat="1"/>
+    <w:lsdException w:name="heading 4" w:semiHidden="1" w:uiPriority="9" w:unhideWhenUsed="1" w:qFormat="1"/>
+    <w:lsdException w:name="heading 5" w:semiHidden="1" w:uiPriority="9" w:unhideWhenUsed="1" w:qFormat="1"/>
+    <w:lsdException w:name="heading 6" w:semiHidden="1" w:uiPriority="9" w:unhideWhenUsed="1" w:qFormat="1"/>
+    <w:lsdException w:name="heading 7" w:semiHidden="1" w:uiPriority="9" w:unhideWhenUsed="1" w:qFormat="1"/>
+    <w:lsdException w:name="heading 8" w:semiHidden="1" w:uiPriority="9" w:unhideWhenUsed="1" w:qFormat="1"/>
+    <w:lsdException w:name="heading 9" w:semiHidden="1" w:uiPriority="9" w:unhideWhenUsed="1" w:qFormat="1"/>
+    <w:lsdException w:name="index 1" w:semiHidden="1" w:unhideWhenUsed="1"/>
+    <w:lsdException w:name="index 2" w:semiHidden="1" w:unhideWhenUsed="1"/>
+    <w:lsdException w:name="index 3" w:semiHidden="1" w:unhideWhenUsed="1"/>
+    <w:lsdException w:name="index 4" w:semiHidden="1" w:unhideWhenUsed="1"/>
+    <w:lsdException w:name="index 5" w:semiHidden="1" w:unhideWhenUsed="1"/>
+    <w:lsdException w:name="index 6" w:semiHidden="1" w:unhideWhenUsed="1"/>
+    <w:lsdException w:name="index 7" w:semiHidden="1" w:unhideWhenUsed="1"/>
+    <w:lsdException w:name="index 8" w:semiHidden="1" w:unhideWhenUsed="1"/>
+    <w:lsdException w:name="index 9" w:semiHidden="1" w:unhideWhenUsed="1"/>
+    <w:lsdException w:name="toc 1" w:semiHidden="1" w:uiPriority="39" w:unhideWhenUsed="1"/>
+    <w:lsdException w:name="toc 2" w:semiHidden="1" w:uiPriority="39" w:unhideWhenUsed="1"/>
+    <w:lsdException w:name="toc 3" w:semiHidden="1" w:uiPriority="39" w:unhideWhenUsed="1"/>
+    <w:lsdException w:name="toc 4" w:semiHidden="1" w:uiPriority="39" w:unhideWhenUsed="1"/>
+    <w:lsdException w:name="toc 5" w:semiHidden="1" w:uiPriority="39" w:unhideWhenUsed="1"/>
+    <w:lsdException w:name="toc 6" w:semiHidden="1" w:uiPriority="39" w:unhideWhenUsed="1"/>
+    <w:lsdException w:name="toc 7" w:semiHidden="1" w:uiPriority="39" w:unhideWhenUsed="1"/>
+    <w:lsdException w:name="toc 8" w:semiHidden="1" w:uiPriority="39" w:unhideWhenUsed="1"/>
+    <w:lsdException w:name="toc 9" w:semiHidden="1" w:uiPriority="39" w:unhideWhenUsed="1"/>
+    <w:lsdException w:name="Normal Indent" w:semiHidden="1" w:unhideWhenUsed="1"/>
+    <w:lsdException w:name="footnote text" w:semiHidden="1" w:unhideWhenUsed="1"/>
+    <w:lsdException w:name="annotation text" w:semiHidden="1" w:unhideWhenUsed="1"/>
+    <w:lsdException w:name="header" w:semiHidden="1" w:unhideWhenUsed="1"/>
+    <w:lsdException w:name="footer" w:semiHidden="1" w:unhideWhenUsed="1"/>
+    <w:lsdException w:name="index heading" w:semiHidden="1" w:unhideWhenUsed="1"/>
+    <w:lsdException w:name="caption" w:semiHidden="1" w:uiPriority="35" w:unhideWhenUsed="1" w:qFormat="1"/>
+    <w:lsdException w:name="table of figures" w:semiHidden="1" w:unhideWhenUsed="1"/>
+    <w:lsdException w:name="envelope address" w:semiHidden="1" w:unhideWhenUsed="1"/>
+    <w:lsdException w:name="envelope return" w:semiHidden="1" w:unhideWhenUsed="1"/>
+    <w:lsdException w:name="footnote reference" w:semiHidden="1" w:unhideWhenUsed="1"/>
+    <w:lsdException w:name="annotation reference" w:semiHidden="1" w:unhideWhenUsed="1"/>
+    <w:lsdException w:name="line number" w:semiHidden="1" w:unhideWhenUsed="1"/>
+    <w:lsdException w:name="page number" w:semiHidden="1" w:unhideWhenUsed="1"/>
+    <w:lsdException w:name="endnote reference" w:semiHidden="1" w:unhideWhenUsed="1"/>
+    <w:lsdException w:name="endnote text" w:semiHidden="1" w:unhideWhenUsed="1"/>
+    <w:lsdException w:name="table of authorities" w:semiHidden="1" w:unhideWhenUsed="1"/>
+    <w:lsdException w:name="macro" w:semiHidden="1" w:unhideWhenUsed="1"/>
+    <w:lsdException w:name="toa heading" w:semiHidden="1" w:unhideWhenUsed="1"/>
+    <w:lsdException w:name="List" w:semiHidden="1" w:unhideWhenUsed="1"/>
+    <w:lsdException w:name="List Bullet" w:semiHidden="1" w:unhideWhenUsed="1"/>
+    <w:lsdException w:name="List Number" w:semiHidden="1" w:unhideWhenUsed="1"/>
+    <w:lsdException w:name="List 2" w:semiHidden="1" w:unhideWhenUsed="1"/>
+    <w:lsdException w:name="List 3" w:semiHidden="1" w:unhideWhenUsed="1"/>
+    <w:lsdException w:name="List 4" w:semiHidden="1" w:unhideWhenUsed="1"/>
+    <w:lsdException w:name="List 5" w:semiHidden="1" w:unhideWhenUsed="1"/>
+    <w:lsdException w:name="List Bullet 2" w:semiHidden="1" w:unhideWhenUsed="1"/>
+    <w:lsdException w:name="List Bullet 3" w:semiHidden="1" w:unhideWhenUsed="1"/>
+    <w:lsdException w:name="List Bullet 4" w:semiHidden="1" w:unhideWhenUsed="1"/>
+    <w:lsdException w:name="List Bullet 5" w:semiHidden="1" w:unhideWhenUsed="1"/>
+    <w:lsdException w:name="List Number 2" w:semiHidden="1" w:unhideWhenUsed="1"/>
+    <w:lsdException w:name="List Number 3" w:semiHidden="1" w:unhideWhenUsed="1"/>
+    <w:lsdException w:name="List Number 4" w:semiHidden="1" w:unhideWhenUsed="1"/>
+    <w:lsdException w:name="List Number 5" w:semiHidden="1" w:unhideWhenUsed="1"/>
+    <w:lsdException w:name="Title" w:uiPriority="10" w:qFormat="1"/>
+    <w:lsdException w:name="Closing" w:semiHidden="1" w:unhideWhenUsed="1"/>
+    <w:lsdException w:name="Signature" w:semiHidden="1" w:unhideWhenUsed="1"/>
+    <w:lsdException w:name="Default Paragraph Font" w:semiHidden="1" w:uiPriority="1" w:unhideWhenUsed="1"/>
+    <w:lsdException w:name="Body Text" w:semiHidden="1" w:unhideWhenUsed="1"/>
+    <w:lsdException w:name="Body Text Indent" w:semiHidden="1" w:unhideWhenUsed="1"/>
+    <w:lsdException w:name="List Continue" w:semiHidden="1" w:unhideWhenUsed="1"/>
+    <w:lsdException w:name="List Continue 2" w:semiHidden="1" w:unhideWhenUsed="1"/>
+    <w:lsdException w:name="List Continue 3" w:semiHidden="1" w:unhideWhenUsed="1"/>
+    <w:lsdException w:name="List Continue 4" w:semiHidden="1" w:unhideWhenUsed="1"/>
+    <w:lsdException w:name="List Continue 5" w:semiHidden="1" w:unhideWhenUsed="1"/>
+    <w:lsdException w:name="Message Header" w:semiHidden="1" w:unhideWhenUsed="1"/>
+    <w:lsdException w:name="Subtitle" w:uiPriority="11" w:qFormat="1"/>
+    <w:lsdException w:name="Salutation" w:semiHidden="1" w:unhideWhenUsed="1"/>
+    <w:lsdException w:name="Date" w:semiHidden="1" w:unhideWhenUsed="1"/>
+    <w:lsdException w:name="Body Text First Indent" w:semiHidden="1" w:unhideWhenUsed="1"/>
+    <w:lsdException w:name="Body Text First Indent 2" w:semiHidden="1" w:unhideWhenUsed="1"/>
+    <w:lsdException w:name="Note Heading" w:semiHidden="1" w:unhideWhenUsed="1"/>
+    <w:lsdException w:name="Body Text 2" w:semiHidden="1" w:unhideWhenUsed="1"/>
+    <w:lsdException w:name="Body Text 3" w:semiHidden="1" w:unhideWhenUsed="1"/>
+    <w:lsdException w:name="Body Text Indent 2" w:semiHidden="1" w:unhideWhenUsed="1"/>
+    <w:lsdException w:name="Body Text Indent 3" w:semiHidden="1" w:unhideWhenUsed="1"/>
+    <w:lsdException w:name="Block Text" w:semiHidden="1" w:unhideWhenUsed="1"/>
+    <w:lsdException w:name="Hyperlink" w:semiHidden="1" w:unhideWhenUsed="1"/>
+    <w:lsdException w:name="FollowedHyperlink" w:semiHidden="1" w:unhideWhenUsed="1"/>
+    <w:lsdException w:name="Strong" w:uiPriority="22" w:qFormat="1"/>
+    <w:lsdException w:name="Emphasis" w:uiPriority="20" w:qFormat="1"/>
+    <w:lsdException w:name="Document Map" w:semiHidden="1" w:unhideWhenUsed="1"/>
+    <w:lsdException w:name="Plain Text" w:semiHidden="1" w:unhideWhenUsed="1"/>
+    <w:lsdException w:name="E-mail Signature" w:semiHidden="1" w:unhideWhenUsed="1"/>
+    <w:lsdException w:name="HTML Top of Form" w:semiHidden="1" w:unhideWhenUsed="1"/>
+    <w:lsdException w:name="HTML Bottom of Form" w:semiHidden="1" w:unhideWhenUsed="1"/>
+    <w:lsdException w:name="Normal (Web)" w:semiHidden="1" w:unhideWhenUsed="1"/>
+    <w:lsdException w:name="HTML Acronym" w:semiHidden="1" w:unhideWhenUsed="1"/>
+    <w:lsdException w:name="HTML Address" w:semiHidden="1" w:unhideWhenUsed="1"/>
+    <w:lsdException w:name="HTML Cite" w:semiHidden="1" w:unhideWhenUsed="1"/>
+    <w:lsdException w:name="HTML Code" w:semiHidden="1" w:unhideWhenUsed="1"/>
+    <w:lsdException w:name="HTML Definition" w:semiHidden="1" w:unhideWhenUsed="1"/>
+    <w:lsdException w:name="HTML Keyboard" w:semiHidden="1" w:unhideWhenUsed="1"/>
+    <w:lsdException w:name="HTML Preformatted" w:semiHidden="1" w:unhideWhenUsed="1"/>
+    <w:lsdException w:name="HTML Sample" w:semiHidden="1" w:unhideWhenUsed="1"/>
+    <w:lsdException w:name="HTML Typewriter" w:semiHidden="1" w:unhideWhenUsed="1"/>
+    <w:lsdException w:name="HTML Variable" w:semiHidden="1" w:unhideWhenUsed="1"/>
+    <w:lsdException w:name="Normal Table" w:semiHidden="1" w:unhideWhenUsed="1"/>
+    <w:lsdException w:name="annotation subject" w:semiHidden="1" w:unhideWhenUsed="1"/>
+    <w:lsdException w:name="No List" w:semiHidden="1" w:unhideWhenUsed="1"/>
+    <w:lsdException w:name="Outline List 1" w:semiHidden="1" w:unhideWhenUsed="1"/>
+    <w:lsdException w:name="Outline List 2" w:semiHidden="1" w:unhideWhenUsed="1"/>
+    <w:lsdException w:name="Outline List 3" w:semiHidden="1" w:unhideWhenUsed="1"/>
+    <w:lsdException w:name="Table Simple 1" w:semiHidden="1" w:unhideWhenUsed="1"/>
+    <w:lsdException w:name="Table Simple 2" w:semiHidden="1" w:unhideWhenUsed="1"/>
+    <w:lsdException w:name="Table Simple 3" w:semiHidden="1" w:unhideWhenUsed="1"/>
+    <w:lsdException w:name="Table Classic 1" w:semiHidden="1" w:unhideWhenUsed="1"/>
+    <w:lsdException w:name="Table Classic 2" w:semiHidden="1" w:unhideWhenUsed="1"/>
+    <w:lsdException w:name="Table Classic 3" w:semiHidden="1" w:unhideWhenUsed="1"/>
+    <w:lsdException w:name="Table Classic 4" w:semiHidden="1" w:unhideWhenUsed="1"/>
+    <w:lsdException w:name="Table Colorful 1" w:semiHidden="1" w:unhideWhenUsed="1"/>
+    <w:lsdException w:name="Table Colorful 2" w:semiHidden="1" w:unhideWhenUsed="1"/>
+    <w:lsdException w:name="Table Colorful 3" w:semiHidden="1" w:unhideWhenUsed="1"/>
+    <w:lsdException w:name="Table Columns 1" w:semiHidden="1" w:unhideWhenUsed="1"/>
+    <w:lsdException w:name="Table Columns 2" w:semiHidden="1" w:unhideWhenUsed="1"/>
+    <w:lsdException w:name="Table Columns 3" w:semiHidden="1" w:unhideWhenUsed="1"/>
+    <w:lsdException w:name="Table Columns 4" w:semiHidden="1" w:unhideWhenUsed="1"/>
+    <w:lsdException w:name="Table Columns 5" w:semiHidden="1" w:unhideWhenUsed="1"/>
+    <w:lsdException w:name="Table Grid 1" w:semiHidden="1" w:unhideWhenUsed="1"/>
+    <w:lsdException w:name="Table Grid 2" w:semiHidden="1" w:unhideWhenUsed="1"/>
+    <w:lsdException w:name="Table Grid 3" w:semiHidden="1" w:unhideWhenUsed="1"/>
+    <w:lsdException w:name="Table Grid 4" w:semiHidden="1" w:unhideWhenUsed="1"/>
+    <w:lsdException w:name="Table Grid 5" w:semiHidden="1" w:unhideWhenUsed="1"/>
+    <w:lsdException w:name="Table Grid 6" w:semiHidden="1" w:unhideWhenUsed="1"/>
+    <w:lsdException w:name="Table Grid 7" w:semiHidden="1" w:unhideWhenUsed="1"/>
+    <w:lsdException w:name="Table Grid 8" w:semiHidden="1" w:unhideWhenUsed="1"/>
+    <w:lsdException w:name="Table List 1" w:semiHidden="1" w:unhideWhenUsed="1"/>
+    <w:lsdException w:name="Table List 2" w:semiHidden="1" w:unhideWhenUsed="1"/>
+    <w:lsdException w:name="Table List 3" w:semiHidden="1" w:unhideWhenUsed="1"/>
+    <w:lsdException w:name="Table List 4" w:semiHidden="1" w:unhideWhenUsed="1"/>
+    <w:lsdException w:name="Table List 5" w:semiHidden="1" w:unhideWhenUsed="1"/>
+    <w:lsdException w:name="Table List 6" w:semiHidden="1" w:unhideWhenUsed="1"/>
+    <w:lsdException w:name="Table List 7" w:semiHidden="1" w:unhideWhenUsed="1"/>
+    <w:lsdException w:name="Table List 8" w:semiHidden="1" w:unhideWhenUsed="1"/>
+    <w:lsdException w:name="Table 3D effects 1" w:semiHidden="1" w:unhideWhenUsed="1"/>
+    <w:lsdException w:name="Table 3D effects 2" w:semiHidden="1" w:unhideWhenUsed="1"/>
+    <w:lsdException w:name="Table 3D effects 3" w:semiHidden="1" w:unhideWhenUsed="1"/>
+    <w:lsdException w:name="Table Contemporary" w:semiHidden="1" w:unhideWhenUsed="1"/>
+    <w:lsdException w:name="Table Elegant" w:semiHidden="1" w:unhideWhenUsed="1"/>
+    <w:lsdException w:name="Table Professional" w:semiHidden="1" w:unhideWhenUsed="1"/>
+    <w:lsdException w:name="Table Subtle 1" w:semiHidden="1" w:unhideWhenUsed="1"/>
+    <w:lsdException w:name="Table Subtle 2" w:semiHidden="1" w:unhideWhenUsed="1"/>
+    <w:lsdException w:name="Table Web 1" w:semiHidden="1" w:unhideWhenUsed="1"/>
+    <w:lsdException w:name="Table Web 2" w:semiHidden="1" w:unhideWhenUsed="1"/>
+    <w:lsdException w:name="Table Web 3" w:semiHidden="1" w:unhideWhenUsed="1"/>
+    <w:lsdException w:name="Balloon Text" w:semiHidden="1" w:unhideWhenUsed="1"/>
+    <w:lsdException w:name="Table Grid" w:uiPriority="39"/>
+    <w:lsdException w:name="Table Theme" w:semiHidden="1" w:unhideWhenUsed="1"/>
+    <w:lsdException w:name="Placeholder Text" w:semiHidden="1"/>
+    <w:lsdException w:name="No Spacing" w:uiPriority="1" w:qFormat="1"/>
+    <w:lsdException w:name="Light Shading" w:uiPriority="60"/>
+    <w:lsdException w:name="Light List" w:uiPriority="61"/>
+    <w:lsdException w:name="Light Grid" w:uiPriority="62"/>
+    <w:lsdException w:name="Medium Shading 1" w:uiPriority="63"/>
+    <w:lsdException w:name="Medium Shading 2" w:uiPriority="64"/>
+    <w:lsdException w:name="Medium List 1" w:uiPriority="65"/>
+    <w:lsdException w:name="Medium List 2" w:uiPriority="66"/>
+    <w:lsdException w:name="Medium Grid 1" w:uiPriority="67"/>
+    <w:lsdException w:name="Medium Grid 2" w:uiPriority="68"/>
+    <w:lsdException w:name="Medium Grid 3" w:uiPriority="69"/>
+    <w:lsdException w:name="Dark List" w:uiPriority="70"/>
+    <w:lsdException w:name="Colorful Shading" w:uiPriority="71"/>
+    <w:lsdException w:name="Colorful List" w:uiPriority="72"/>
+    <w:lsdException w:name="Colorful Grid" w:uiPriority="73"/>
+    <w:lsdException w:name="Light Shading Accent 1" w:uiPriority="60"/>
+    <w:lsdException w:name="Light List Accent 1" w:uiPriority="61"/>
+    <w:lsdException w:name="Light Grid Accent 1" w:uiPriority="62"/>
+    <w:lsdException w:name="Medium Shading 1 Accent 1" w:uiPriority="63"/>
+    <w:lsdException w:name="Medium Shading 2 Accent 1" w:uiPriority="64"/>
+    <w:lsdException w:name="Medium List 1 Accent 1" w:uiPriority="65"/>
+    <w:lsdException w:name="Revision" w:semiHidden="1"/>
+    <w:lsdException w:name="List Paragraph" w:uiPriority="34" w:qFormat="1"/>
+    <w:lsdException w:name="Quote" w:uiPriority="29" w:qFormat="1"/>
+    <w:lsdException w:name="Intense Quote" w:uiPriority="30" w:qFormat="1"/>
+    <w:lsdException w:name="Medium List 2 Accent 1" w:uiPriority="66"/>
+    <w:lsdException w:name="Medium Grid 1 Accent 1" w:uiPriority="67"/>
+    <w:lsdException w:name="Medium Grid 2 Accent 1" w:uiPriority="68"/>
+    <w:lsdException w:name="Medium Grid 3 Accent 1" w:uiPriority="69"/>
+    <w:lsdException w:name="Dark List Accent 1" w:uiPriority="70"/>
+    <w:lsdException w:name="Colorful Shading Accent 1" w:uiPriority="71"/>
+    <w:lsdException w:name="Colorful List Accent 1" w:uiPriority="72"/>
+    <w:lsdException w:name="Colorful Grid Accent 1" w:uiPriority="73"/>
+    <w:lsdException w:name="Light Shading Accent 2" w:uiPriority="60"/>
+    <w:lsdException w:name="Light List Accent 2" w:uiPriority="61"/>
+    <w:lsdException w:name="Light Grid Accent 2" w:uiPriority="62"/>
+    <w:lsdException w:name="Medium Shading 1 Accent 2" w:uiPriority="63"/>
+    <w:lsdException w:name="Medium Shading 2 Accent 2" w:uiPriority="64"/>
+    <w:lsdException w:name="Medium List 1 Accent 2" w:uiPriority="65"/>
+    <w:lsdException w:name="Medium List 2 Accent 2" w:uiPriority="66"/>
+    <w:lsdException w:name="Medium Grid 1 Accent 2" w:uiPriority="67"/>
+    <w:lsdException w:name="Medium Grid 2 Accent 2" w:uiPriority="68"/>
+    <w:lsdException w:name="Medium Grid 3 Accent 2" w:uiPriority="69"/>
+    <w:lsdException w:name="Dark List Accent 2" w:uiPriority="70"/>
+    <w:lsdException w:name="Colorful Shading Accent 2" w:uiPriority="71"/>
+    <w:lsdException w:name="Colorful List Accent 2" w:uiPriority="72"/>
+    <w:lsdException w:name="Colorful Grid Accent 2" w:uiPriority="73"/>
+    <w:lsdException w:name="Light Shading Accent 3" w:uiPriority="60"/>
+    <w:lsdException w:name="Light List Accent 3" w:uiPriority="61"/>
+    <w:lsdException w:name="Light Grid Accent 3" w:uiPriority="62"/>
+    <w:lsdException w:name="Medium Shading 1 Accent 3" w:uiPriority="63"/>
+    <w:lsdException w:name="Medium Shading 2 Accent 3" w:uiPriority="64"/>
+    <w:lsdException w:name="Medium List 1 Accent 3" w:uiPriority="65"/>
+    <w:lsdException w:name="Medium List 2 Accent 3" w:uiPriority="66"/>
+    <w:lsdException w:name="Medium Grid 1 Accent 3" w:uiPriority="67"/>
+    <w:lsdException w:name="Medium Grid 2 Accent 3" w:uiPriority="68"/>
+    <w:lsdException w:name="Medium Grid 3 Accent 3" w:uiPriority="69"/>
+    <w:lsdException w:name="Dark List Accent 3" w:uiPriority="70"/>
+    <w:lsdException w:name="Colorful Shading Accent 3" w:uiPriority="71"/>
+    <w:lsdException w:name="Colorful List Accent 3" w:uiPriority="72"/>
+    <w:lsdException w:name="Colorful Grid Accent 3" w:uiPriority="73"/>
+    <w:lsdException w:name="Light Shading Accent 4" w:uiPriority="60"/>
+    <w:lsdException w:name="Light List Accent 4" w:uiPriority="61"/>
+    <w:lsdException w:name="Light Grid Accent 4" w:uiPriority="62"/>
+    <w:lsdException w:name="Medium Shading 1 Accent 4" w:uiPriority="63"/>
+    <w:lsdException w:name="Medium Shading 2 Accent 4" w:uiPriority="64"/>
+    <w:lsdException w:name="Medium List 1 Accent 4" w:uiPriority="65"/>
+    <w:lsdException w:name="Medium List 2 Accent 4" w:uiPriority="66"/>
+    <w:lsdException w:name="Medium Grid 1 Accent 4" w:uiPriority="67"/>
+    <w:lsdException w:name="Medium Grid 2 Accent 4" w:uiPriority="68"/>
+    <w:lsdException w:name="Medium Grid 3 Accent 4" w:uiPriority="69"/>
+    <w:lsdException w:name="Dark List Accent 4" w:uiPriority="70"/>
+    <w:lsdException w:name="Colorful Shading Accent 4" w:uiPriority="71"/>
+    <w:lsdException w:name="Colorful List Accent 4" w:uiPriority="72"/>
+    <w:lsdException w:name="Colorful Grid Accent 4" w:uiPriority="73"/>
+    <w:lsdException w:name="Light Shading Accent 5" w:uiPriority="60"/>
+    <w:lsdException w:name="Light List Accent 5" w:uiPriority="61"/>
+    <w:lsdException w:name="Light Grid Accent 5" w:uiPriority="62"/>
+    <w:lsdException w:name="Medium Shading 1 Accent 5" w:uiPriority="63"/>
+    <w:lsdException w:name="Medium Shading 2 Accent 5" w:uiPriority="64"/>
+    <w:lsdException w:name="Medium List 1 Accent 5" w:uiPriority="65"/>
+    <w:lsdException w:name="Medium List 2 Accent 5" w:uiPriority="66"/>
+    <w:lsdException w:name="Medium Grid 1 Accent 5" w:uiPriority="67"/>
+    <w:lsdException w:name="Medium Grid 2 Accent 5" w:uiPriority="68"/>
+    <w:lsdException w:name="Medium Grid 3 Accent 5" w:uiPriority="69"/>
+    <w:lsdException w:name="Dark List Accent 5" w:uiPriority="70"/>
+    <w:lsdException w:name="Colorful Shading Accent 5" w:uiPriority="71"/>
+    <w:lsdException w:name="Colorful List Accent 5" w:uiPriority="72"/>
+    <w:lsdException w:name="Colorful Grid Accent 5" w:uiPriority="73"/>
+    <w:lsdException w:name="Light Shading Accent 6" w:uiPriority="60"/>
+    <w:lsdException w:name="Light List Accent 6" w:uiPriority="61"/>
+    <w:lsdException w:name="Light Grid Accent 6" w:uiPriority="62"/>
+    <w:lsdException w:name="Medium Shading 1 Accent 6" w:uiPriority="63"/>
+    <w:lsdException w:name="Medium Shading 2 Accent 6" w:uiPriority="64"/>
+    <w:lsdException w:name="Medium List 1 Accent 6" w:uiPriority="65"/>
+    <w:lsdException w:name="Medium List 2 Accent 6" w:uiPriority="66"/>
+    <w:lsdException w:name="Medium Grid 1 Accent 6" w:uiPriority="67"/>
+    <w:lsdException w:name="Medium Grid 2 Accent 6" w:uiPriority="68"/>
+    <w:lsdException w:name="Medium Grid 3 Accent 6" w:uiPriority="69"/>
+    <w:lsdException w:name="Dark List Accent 6" w:uiPriority="70"/>
+    <w:lsdException w:name="Colorful Shading Accent 6" w:uiPriority="71"/>
+    <w:lsdException w:name="Colorful List Accent 6" w:uiPriority="72"/>
+    <w:lsdException w:name="Colorful Grid Accent 6" w:uiPriority="73"/>
+    <w:lsdException w:name="Subtle Emphasis" w:uiPriority="19" w:qFormat="1"/>
+    <w:lsdException w:name="Intense Emphasis" w:uiPriority="21" w:qFormat="1"/>
+    <w:lsdException w:name="Subtle Reference" w:uiPriority="31" w:qFormat="1"/>
+    <w:lsdException w:name="Intense Reference" w:uiPriority="32" w:qFormat="1"/>
+    <w:lsdException w:name="Book Title" w:uiPriority="33" w:qFormat="1"/>
+    <w:lsdException w:name="Bibliography" w:semiHidden="1" w:uiPriority="37" w:unhideWhenUsed="1"/>
+    <w:lsdException w:name="TOC Heading" w:semiHidden="1" w:uiPriority="39" w:unhideWhenUsed="1" w:qFormat="1"/>
+    <w:lsdException w:name="Plain Table 1" w:uiPriority="41"/>
+    <w:lsdException w:name="Plain Table 2" w:uiPriority="42"/>
+    <w:lsdException w:name="Plain Table 3" w:uiPriority="43"/>
+    <w:lsdException w:name="Plain Table 4" w:uiPriority="44"/>
+    <w:lsdException w:name="Plain Table 5" w:uiPriority="45"/>
+    <w:lsdException w:name="Grid Table Light" w:uiPriority="40"/>
+    <w:lsdException w:name="Grid Table 1 Light" w:uiPriority="46"/>
+    <w:lsdException w:name="Grid Table 2" w:uiPriority="47"/>
+    <w:lsdException w:name="Grid Table 3" w:uiPriority="48"/>
+    <w:lsdException w:name="Grid Table 4" w:uiPriority="49"/>
+    <w:lsdException w:name="Grid Table 5 Dark" w:uiPriority="50"/>
+    <w:lsdException w:name="Grid Table 6 Colorful" w:uiPriority="51"/>
+    <w:lsdException w:name="Grid Table 7 Colorful" w:uiPriority="52"/>
+    <w:lsdException w:name="Grid Table 1 Light Accent 1" w:uiPriority="46"/>
+    <w:lsdException w:name="Grid Table 2 Accent 1" w:uiPriority="47"/>
+    <w:lsdException w:name="Grid Table 3 Accent 1" w:uiPriority="48"/>
+    <w:lsdException w:name="Grid Table 4 Accent 1" w:uiPriority="49"/>
+    <w:lsdException w:name="Grid Table 5 Dark Accent 1" w:uiPriority="50"/>
+    <w:lsdException w:name="Grid Table 6 Colorful Accent 1" w:uiPriority="51"/>
+    <w:lsdException w:name="Grid Table 7 Colorful Accent 1" w:uiPriority="52"/>
+    <w:lsdException w:name="Grid Table 1 Light Accent 2" w:uiPriority="46"/>
+    <w:lsdException w:name="Grid Table 2 Accent 2" w:uiPriority="47"/>
+    <w:lsdException w:name="Grid Table 3 Accent 2" w:uiPriority="48"/>
+    <w:lsdException w:name="Grid Table 4 Accent 2" w:uiPriority="49"/>
+    <w:lsdException w:name="Grid Table 5 Dark Accent 2" w:uiPriority="50"/>
+    <w:lsdException w:name="Grid Table 6 Colorful Accent 2" w:uiPriority="51"/>
+    <w:lsdException w:name="Grid Table 7 Colorful Accent 2" w:uiPriority="52"/>
+    <w:lsdException w:name="Grid Table 1 Light Accent 3" w:uiPriority="46"/>
+    <w:lsdException w:name="Grid Table 2 Accent 3" w:uiPriority="47"/>
+    <w:lsdException w:name="Grid Table 3 Accent 3" w:uiPriority="48"/>
+    <w:lsdException w:name="Grid Table 4 Accent 3" w:uiPriority="49"/>
+    <w:lsdException w:name="Grid Table 5 Dark Accent 3" w:uiPriority="50"/>
+    <w:lsdException w:name="Grid Table 6 Colorful Accent 3" w:uiPriority="51"/>
+    <w:lsdException w:name="Grid Table 7 Colorful Accent 3" w:uiPriority="52"/>
+    <w:lsdException w:name="Grid Table 1 Light Accent 4" w:uiPriority="46"/>
+    <w:lsdException w:name="Grid Table 2 Accent 4" w:uiPriority="47"/>
+    <w:lsdException w:name="Grid Table 3 Accent 4" w:uiPriority="48"/>
+    <w:lsdException w:name="Grid Table 4 Accent 4" w:uiPriority="49"/>
+    <w:lsdException w:name="Grid Table 5 Dark Accent 4" w:uiPriority="50"/>
+    <w:lsdException w:name="Grid Table 6 Colorful Accent 4" w:uiPriority="51"/>
+    <w:lsdException w:name="Grid Table 7 Colorful Accent 4" w:uiPriority="52"/>
+    <w:lsdException w:name="Grid Table 1 Light Accent 5" w:uiPriority="46"/>
+    <w:lsdException w:name="Grid Table 2 Accent 5" w:uiPriority="47"/>
+    <w:lsdException w:name="Grid Table 3 Accent 5" w:uiPriority="48"/>
+    <w:lsdException w:name="Grid Table 4 Accent 5" w:uiPriority="49"/>
+    <w:lsdException w:name="Grid Table 5 Dark Accent 5" w:uiPriority="50"/>
+    <w:lsdException w:name="Grid Table 6 Colorful Accent 5" w:uiPriority="51"/>
+    <w:lsdException w:name="Grid Table 7 Colorful Accent 5" w:uiPriority="52"/>
+    <w:lsdException w:name="Grid Table 1 Light Accent 6" w:uiPriority="46"/>
+    <w:lsdException w:name="Grid Table 2 Accent 6" w:uiPriority="47"/>
+    <w:lsdException w:name="Grid Table 3 Accent 6" w:uiPriority="48"/>
+    <w:lsdException w:name="Grid Table 4 Accent 6" w:uiPriority="49"/>
+    <w:lsdException w:name="Grid Table 5 Dark Accent 6" w:uiPriority="50"/>
+    <w:lsdException w:name="Grid Table 6 Colorful Accent 6" w:uiPriority="51"/>
+    <w:lsdException w:name="Grid Table 7 Colorful Accent 6" w:uiPriority="52"/>
+    <w:lsdException w:name="List Table 1 Light" w:uiPriority="46"/>
+    <w:lsdException w:name="List Table 2" w:uiPriority="47"/>
+    <w:lsdException w:name="List Table 3" w:uiPriority="48"/>
+    <w:lsdException w:name="List Table 4" w:uiPriority="49"/>
+    <w:lsdException w:name="List Table 5 Dark" w:uiPriority="50"/>
+    <w:lsdException w:name="List Table 6 Colorful" w:uiPriority="51"/>
+    <w:lsdException w:name="List Table 7 Colorful" w:uiPriority="52"/>
+    <w:lsdException w:name="List Table 1 Light Accent 1" w:uiPriority="46"/>
+    <w:lsdException w:name="List Table 2 Accent 1" w:uiPriority="47"/>
+    <w:lsdException w:name="List Table 3 Accent 1" w:uiPriority="48"/>
+    <w:lsdException w:name="List Table 4 Accent 1" w:uiPriority="49"/>
+    <w:lsdException w:name="List Table 5 Dark Accent 1" w:uiPriority="50"/>
+    <w:lsdException w:name="List Table 6 Colorful Accent 1" w:uiPriority="51"/>
+    <w:lsdException w:name="List Table 7 Colorful Accent 1" w:uiPriority="52"/>
+    <w:lsdException w:name="List Table 1 Light Accent 2" w:uiPriority="46"/>
+    <w:lsdException w:name="List Table 2 Accent 2" w:uiPriority="47"/>
+    <w:lsdException w:name="List Table 3 Accent 2" w:uiPriority="48"/>
+    <w:lsdException w:name="List Table 4 Accent 2" w:uiPriority="49"/>
+    <w:lsdException w:name="List Table 5 Dark Accent 2" w:uiPriority="50"/>
+    <w:lsdException w:name="List Table 6 Colorful Accent 2" w:uiPriority="51"/>
+    <w:lsdException w:name="List Table 7 Colorful Accent 2" w:uiPriority="52"/>
+    <w:lsdException w:name="List Table 1 Light Accent 3" w:uiPriority="46"/>
+    <w:lsdException w:name="List Table 2 Accent 3" w:uiPriority="47"/>
+    <w:lsdException w:name="List Table 3 Accent 3" w:uiPriority="48"/>
+    <w:lsdException w:name="List Table 4 Accent 3" w:uiPriority="49"/>
+    <w:lsdException w:name="List Table 5 Dark Accent 3" w:uiPriority="50"/>
+    <w:lsdException w:name="List Table 6 Colorful Accent 3" w:uiPriority="51"/>
+    <w:lsdException w:name="List Table 7 Colorful Accent 3" w:uiPriority="52"/>
+    <w:lsdException w:name="List Table 1 Light Accent 4" w:uiPriority="46"/>
+    <w:lsdException w:name="List Table 2 Accent 4" w:uiPriority="47"/>
+    <w:lsdException w:name="List Table 3 Accent 4" w:uiPriority="48"/>
+    <w:lsdException w:name="List Table 4 Accent 4" w:uiPriority="49"/>
+    <w:lsdException w:name="List Table 5 Dark Accent 4" w:uiPriority="50"/>
+    <w:lsdException w:name="List Table 6 Colorful Accent 4" w:uiPriority="51"/>
+    <w:lsdException w:name="List Table 7 Colorful Accent 4" w:uiPriority="52"/>
+    <w:lsdException w:name="List Table 1 Light Accent 5" w:uiPriority="46"/>
+    <w:lsdException w:name="List Table 2 Accent 5" w:uiPriority="47"/>
+    <w:lsdException w:name="List Table 3 Accent 5" w:uiPriority="48"/>
+    <w:lsdException w:name="List Table 4 Accent 5" w:uiPriority="49"/>
+    <w:lsdException w:name="List Table 5 Dark Accent 5" w:uiPriority="50"/>
+    <w:lsdException w:name="List Table 6 Colorful Accent 5" w:uiPriority="51"/>
+    <w:lsdException w:name="List Table 7 Colorful Accent 5" w:uiPriority="52"/>
+    <w:lsdException w:name="List Table 1 Light Accent 6" w:uiPriority="46"/>
+    <w:lsdException w:name="List Table 2 Accent 6" w:uiPriority="47"/>
+    <w:lsdException w:name="List Table 3 Accent 6" w:uiPriority="48"/>
+    <w:lsdException w:name="List Table 4 Accent 6" w:uiPriority="49"/>
+    <w:lsdException w:name="List Table 5 Dark Accent 6" w:uiPriority="50"/>
+    <w:lsdException w:name="List Table 6 Colorful Accent 6" w:uiPriority="51"/>
+    <w:lsdException w:name="List Table 7 Colorful Accent 6" w:uiPriority="52"/>
+    <w:lsdException w:name="Mention" w:semiHidden="1" w:unhideWhenUsed="1"/>
+    <w:lsdException w:name="Smart Hyperlink" w:semiHidden="1" w:unhideWhenUsed="1"/>
+    <w:lsdException w:name="Hashtag" w:semiHidden="1" w:unhideWhenUsed="1"/>
+    <w:lsdException w:name="Unresolved Mention" w:semiHidden="1" w:unhideWhenUsed="1"/>
+    <w:lsdException w:name="Smart Link" w:semiHidden="1" w:unhideWhenUsed="1"/>
+  </w:latentStyles>
+  <w:style w:type="paragraph" w:default="1" w:styleId="Normal">
+    <w:name w:val="Normal"/>
+    <w:qFormat/>
   </w:style>
-  <w:style w:type="paragraph" w:styleId="Normal" w:default="1">
-    <w:name w:val="normal"/>
-  </w:style>
-  <w:style w:type="paragraph" w:styleId="Heading1">
+  <w:style w:type="paragraph" w:styleId="Ttulo1">
     <w:name w:val="heading 1"/>
     <w:basedOn w:val="Normal"/>
     <w:next w:val="Normal"/>
+    <w:uiPriority w:val="9"/>
+    <w:qFormat/>
     <w:pPr>
-      <w:keepNext w:val="1"/>
-      <w:keepLines w:val="1"/>
-      <w:pageBreakBefore w:val="0"/>
-      <w:spacing w:after="120" w:before="400" w:lineRule="auto"/>
+      <w:keepNext/>
+      <w:keepLines/>
+      <w:spacing w:before="400" w:after="120"/>
+      <w:outlineLvl w:val="0"/>
     </w:pPr>
     <w:rPr>
       <w:sz w:val="40"/>
       <w:szCs w:val="40"/>
     </w:rPr>
   </w:style>
-  <w:style w:type="paragraph" w:styleId="Heading2">
+  <w:style w:type="paragraph" w:styleId="Ttulo2">
     <w:name w:val="heading 2"/>
     <w:basedOn w:val="Normal"/>
     <w:next w:val="Normal"/>
+    <w:uiPriority w:val="9"/>
+    <w:semiHidden/>
+    <w:unhideWhenUsed/>
+    <w:qFormat/>
     <w:pPr>
-      <w:keepNext w:val="1"/>
-      <w:keepLines w:val="1"/>
-      <w:pageBreakBefore w:val="0"/>
-      <w:spacing w:after="120" w:before="360" w:lineRule="auto"/>
+      <w:keepNext/>
+      <w:keepLines/>
+      <w:spacing w:before="360" w:after="120"/>
+      <w:outlineLvl w:val="1"/>
     </w:pPr>
     <w:rPr>
-      <w:b w:val="0"/>
-      <w:bCs w:val="0"/>
       <w:sz w:val="32"/>
       <w:szCs w:val="32"/>
     </w:rPr>
   </w:style>
-  <w:style w:type="paragraph" w:styleId="Heading3">
+  <w:style w:type="paragraph" w:styleId="Ttulo3">
     <w:name w:val="heading 3"/>
     <w:basedOn w:val="Normal"/>
     <w:next w:val="Normal"/>
+    <w:uiPriority w:val="9"/>
+    <w:semiHidden/>
+    <w:unhideWhenUsed/>
+    <w:qFormat/>
     <w:pPr>
-      <w:keepNext w:val="1"/>
-      <w:keepLines w:val="1"/>
-      <w:pageBreakBefore w:val="0"/>
-      <w:spacing w:after="80" w:before="320" w:lineRule="auto"/>
+      <w:keepNext/>
+      <w:keepLines/>
+      <w:spacing w:before="320" w:after="80"/>
+      <w:outlineLvl w:val="2"/>
     </w:pPr>
     <w:rPr>
-      <w:b w:val="0"/>
-      <w:bCs w:val="0"/>
       <w:color w:val="434343"/>
       <w:sz w:val="28"/>
       <w:szCs w:val="28"/>
     </w:rPr>
   </w:style>
-  <w:style w:type="paragraph" w:styleId="Heading4">
+  <w:style w:type="paragraph" w:styleId="Ttulo4">
     <w:name w:val="heading 4"/>
     <w:basedOn w:val="Normal"/>
     <w:next w:val="Normal"/>
+    <w:uiPriority w:val="9"/>
+    <w:semiHidden/>
+    <w:unhideWhenUsed/>
+    <w:qFormat/>
     <w:pPr>
-      <w:keepNext w:val="1"/>
-      <w:keepLines w:val="1"/>
-      <w:pageBreakBefore w:val="0"/>
-      <w:spacing w:after="80" w:before="280" w:lineRule="auto"/>
+      <w:keepNext/>
+      <w:keepLines/>
+      <w:spacing w:before="280" w:after="80"/>
+      <w:outlineLvl w:val="3"/>
     </w:pPr>
     <w:rPr>
       <w:color w:val="666666"/>
@@ -1464,69 +1623,110 @@
       <w:szCs w:val="24"/>
     </w:rPr>
   </w:style>
-  <w:style w:type="paragraph" w:styleId="Heading5">
+  <w:style w:type="paragraph" w:styleId="Ttulo5">
     <w:name w:val="heading 5"/>
     <w:basedOn w:val="Normal"/>
     <w:next w:val="Normal"/>
+    <w:uiPriority w:val="9"/>
+    <w:semiHidden/>
+    <w:unhideWhenUsed/>
+    <w:qFormat/>
     <w:pPr>
-      <w:keepNext w:val="1"/>
-      <w:keepLines w:val="1"/>
-      <w:pageBreakBefore w:val="0"/>
-      <w:spacing w:after="80" w:before="240" w:lineRule="auto"/>
+      <w:keepNext/>
+      <w:keepLines/>
+      <w:spacing w:before="240" w:after="80"/>
+      <w:outlineLvl w:val="4"/>
     </w:pPr>
     <w:rPr>
       <w:color w:val="666666"/>
-      <w:sz w:val="22"/>
-      <w:szCs w:val="22"/>
     </w:rPr>
   </w:style>
-  <w:style w:type="paragraph" w:styleId="Heading6">
+  <w:style w:type="paragraph" w:styleId="Ttulo6">
     <w:name w:val="heading 6"/>
     <w:basedOn w:val="Normal"/>
     <w:next w:val="Normal"/>
+    <w:uiPriority w:val="9"/>
+    <w:semiHidden/>
+    <w:unhideWhenUsed/>
+    <w:qFormat/>
     <w:pPr>
-      <w:keepNext w:val="1"/>
-      <w:keepLines w:val="1"/>
-      <w:pageBreakBefore w:val="0"/>
-      <w:spacing w:after="80" w:before="240" w:lineRule="auto"/>
+      <w:keepNext/>
+      <w:keepLines/>
+      <w:spacing w:before="240" w:after="80"/>
+      <w:outlineLvl w:val="5"/>
     </w:pPr>
     <w:rPr>
-      <w:i w:val="1"/>
-      <w:iCs w:val="1"/>
+      <w:i/>
+      <w:iCs/>
       <w:color w:val="666666"/>
-      <w:sz w:val="22"/>
-      <w:szCs w:val="22"/>
     </w:rPr>
   </w:style>
-  <w:style w:type="paragraph" w:styleId="Title">
+  <w:style w:type="character" w:default="1" w:styleId="Fuentedeprrafopredeter">
+    <w:name w:val="Default Paragraph Font"/>
+    <w:uiPriority w:val="1"/>
+    <w:semiHidden/>
+    <w:unhideWhenUsed/>
+  </w:style>
+  <w:style w:type="table" w:default="1" w:styleId="Tablanormal">
+    <w:name w:val="Normal Table"/>
+    <w:uiPriority w:val="99"/>
+    <w:semiHidden/>
+    <w:unhideWhenUsed/>
+    <w:tblPr>
+      <w:tblInd w:w="0" w:type="dxa"/>
+      <w:tblCellMar>
+        <w:top w:w="0" w:type="dxa"/>
+        <w:left w:w="108" w:type="dxa"/>
+        <w:bottom w:w="0" w:type="dxa"/>
+        <w:right w:w="108" w:type="dxa"/>
+      </w:tblCellMar>
+    </w:tblPr>
+  </w:style>
+  <w:style w:type="numbering" w:default="1" w:styleId="Sinlista">
+    <w:name w:val="No List"/>
+    <w:uiPriority w:val="99"/>
+    <w:semiHidden/>
+    <w:unhideWhenUsed/>
+  </w:style>
+  <w:style w:type="table" w:customStyle="1" w:styleId="TableNormal">
+    <w:name w:val="TableNormal"/>
+    <w:tblPr>
+      <w:tblCellMar>
+        <w:top w:w="100" w:type="dxa"/>
+        <w:left w:w="100" w:type="dxa"/>
+        <w:bottom w:w="100" w:type="dxa"/>
+        <w:right w:w="100" w:type="dxa"/>
+      </w:tblCellMar>
+    </w:tblPr>
+  </w:style>
+  <w:style w:type="paragraph" w:styleId="Ttulo">
     <w:name w:val="Title"/>
     <w:basedOn w:val="Normal"/>
     <w:next w:val="Normal"/>
+    <w:uiPriority w:val="10"/>
+    <w:qFormat/>
     <w:pPr>
-      <w:keepNext w:val="1"/>
-      <w:keepLines w:val="1"/>
-      <w:pageBreakBefore w:val="0"/>
-      <w:spacing w:after="60" w:before="0" w:lineRule="auto"/>
+      <w:keepNext/>
+      <w:keepLines/>
+      <w:spacing w:after="60"/>
     </w:pPr>
     <w:rPr>
       <w:sz w:val="52"/>
       <w:szCs w:val="52"/>
     </w:rPr>
   </w:style>
-  <w:style w:type="paragraph" w:styleId="Subtitle">
+  <w:style w:type="paragraph" w:styleId="Subttulo">
     <w:name w:val="Subtitle"/>
     <w:basedOn w:val="Normal"/>
     <w:next w:val="Normal"/>
+    <w:uiPriority w:val="11"/>
+    <w:qFormat/>
     <w:pPr>
-      <w:keepNext w:val="1"/>
-      <w:keepLines w:val="1"/>
-      <w:pageBreakBefore w:val="0"/>
-      <w:spacing w:after="320" w:before="0" w:lineRule="auto"/>
+      <w:keepNext/>
+      <w:keepLines/>
+      <w:spacing w:after="320"/>
     </w:pPr>
     <w:rPr>
-      <w:rFonts w:ascii="Arial" w:cs="Arial" w:eastAsia="Arial" w:hAnsi="Arial"/>
-      <w:i w:val="0"/>
-      <w:iCs w:val="0"/>
       <w:color w:val="666666"/>
       <w:sz w:val="30"/>
       <w:szCs w:val="30"/>

</xml_diff>

<commit_message>
Commitear recursos nuevos y actualización del GDD
</commit_message>
<xml_diff>
--- a/docs/TF DT2 GDD.docx
+++ b/docs/TF DT2 GDD.docx
@@ -11,23 +11,7 @@
         <w:t xml:space="preserve">Alumnos: </w:t>
       </w:r>
       <w:r>
-        <w:t xml:space="preserve">Leno, Rocío Abril - </w:t>
-      </w:r>
-      <w:proofErr w:type="spellStart"/>
-      <w:r>
-        <w:t>Monutti</w:t>
-      </w:r>
-      <w:proofErr w:type="spellEnd"/>
-      <w:r>
-        <w:t xml:space="preserve"> </w:t>
-      </w:r>
-      <w:proofErr w:type="spellStart"/>
-      <w:r>
-        <w:t>Previderé</w:t>
-      </w:r>
-      <w:proofErr w:type="spellEnd"/>
-      <w:r>
-        <w:t>, Margarita</w:t>
+        <w:t>Leno, Rocío Abril - Monutti Previderé, Margarita</w:t>
       </w:r>
     </w:p>
     <w:p/>
@@ -58,7 +42,16 @@
         </w:numPr>
       </w:pPr>
       <w:r>
-        <w:t>Movimiento en cuatro direcciones.</w:t>
+        <w:t>Movimiento en cuatro direcciones</w:t>
+      </w:r>
+      <w:r>
+        <w:t xml:space="preserve"> (Arriba, Abajo, Izquierda, Derecha)</w:t>
+      </w:r>
+      <w:r>
+        <w:t>.</w:t>
+      </w:r>
+      <w:r>
+        <w:t xml:space="preserve"> Acorde a los puntos cardinales.</w:t>
       </w:r>
     </w:p>
     <w:p>
@@ -190,33 +183,10 @@
         <w:t>Disparar:</w:t>
       </w:r>
       <w:r>
-        <w:t xml:space="preserve"> </w:t>
-      </w:r>
-      <w:proofErr w:type="spellStart"/>
-      <w:r>
-        <w:t>Click</w:t>
-      </w:r>
-      <w:proofErr w:type="spellEnd"/>
-      <w:r>
-        <w:t xml:space="preserve"> derecho</w:t>
-      </w:r>
-    </w:p>
-    <w:p>
-      <w:pPr>
-        <w:numPr>
-          <w:ilvl w:val="0"/>
-          <w:numId w:val="5"/>
-        </w:numPr>
-      </w:pPr>
-      <w:r>
-        <w:rPr>
-          <w:b/>
-          <w:bCs/>
-        </w:rPr>
-        <w:t>Consumir comida:</w:t>
-      </w:r>
-      <w:r>
-        <w:t xml:space="preserve"> C</w:t>
+        <w:t xml:space="preserve"> Click derecho</w:t>
+      </w:r>
+      <w:r>
+        <w:t>. La dirección de la flecha es dependiente de hacia cuál de los 4 puntos cardinales este mirando el jugador.</w:t>
       </w:r>
     </w:p>
     <w:p>
@@ -253,57 +223,33 @@
     </w:p>
     <w:p>
       <w:r>
-        <w:t xml:space="preserve">Juego </w:t>
-      </w:r>
-      <w:proofErr w:type="spellStart"/>
-      <w:r>
-        <w:t>topdown</w:t>
-      </w:r>
-      <w:proofErr w:type="spellEnd"/>
-      <w:r>
-        <w:t xml:space="preserve"> con disparos. Inspirado en el título de NES, </w:t>
-      </w:r>
-      <w:proofErr w:type="spellStart"/>
-      <w:r>
-        <w:t>Zombies</w:t>
-      </w:r>
-      <w:proofErr w:type="spellEnd"/>
-      <w:r>
-        <w:t xml:space="preserve"> Ate </w:t>
-      </w:r>
-      <w:proofErr w:type="spellStart"/>
-      <w:r>
-        <w:t>My</w:t>
-      </w:r>
-      <w:proofErr w:type="spellEnd"/>
-      <w:r>
-        <w:t xml:space="preserve"> </w:t>
-      </w:r>
-      <w:proofErr w:type="spellStart"/>
-      <w:r>
-        <w:t>Neighbours</w:t>
-      </w:r>
-      <w:proofErr w:type="spellEnd"/>
-      <w:r>
-        <w:t xml:space="preserve"> (1993).</w:t>
+        <w:t>Juego topdown con disparos. Inspirado en el título de NES, Zombies Ate My Neighbours (1993).</w:t>
       </w:r>
     </w:p>
     <w:p/>
+    <w:p>
+      <w:r>
+        <w:t>El jugador se encuentra atrapado en un laberinto peligroso del cual debe escapar con los pocos recursos que tiene a su disposición: una ballesta para atacar y una bolsa con poca comida.</w:t>
+      </w:r>
+    </w:p>
+    <w:p>
+      <w:r>
+        <w:t>No puede escapar del laberinto solo dando vueltas, el jugador debe encontrar un total de tres llaves dispersas por el nivel. Las cuales son cada vez más difíciles de encontrar a medida que se avanza en cada nivel. Además, se encontrará con diferentes enemigos en cada nivel que le dificultarán</w:t>
+      </w:r>
+      <w:r>
+        <w:t>. Cada laberinto está generado de forma procedural.</w:t>
+      </w:r>
+    </w:p>
     <w:p/>
     <w:p>
       <w:r>
-        <w:t>El jugador se encuentra atrapado en un laberinto peligroso del cual debe escapar con los pocos recursos que tiene a su disposición: una ballesta para atacar y una bolsa con poca comida.</w:t>
-      </w:r>
-    </w:p>
-    <w:p>
-      <w:r>
-        <w:t>No puede escapar del laberinto solo dando vueltas, el jugador debe encontrar un total de tres llaves dispersas por el nivel. Las cuales son cada vez más difíciles de encontrar a medida que se avanza en cada nivel. Además, se encontrará con diferentes enemigos en cada nivel que le dificultarán</w:t>
-      </w:r>
-    </w:p>
-    <w:p/>
-    <w:p>
-      <w:r>
-        <w:t>El jugador podrá, en ciertas ocasiones, saltar las paredes del laberinto para llegar a un lugar de difícil acceso. Esto solo es posible si en ambas partes de la pared se encuentra un hongo saltarín que ayude en esto.</w:t>
+        <w:t xml:space="preserve">El jugador podrá, en ciertas ocasiones, saltar las paredes del laberinto para llegar a un lugar de difícil acceso. </w:t>
+      </w:r>
+      <w:r>
+        <w:t>Esto es gracias a un hongo saltarín que se encuentra de ambos lados de la pared</w:t>
+      </w:r>
+      <w:r>
+        <w:t>.</w:t>
       </w:r>
     </w:p>
     <w:p/>
@@ -350,6 +296,72 @@
       </w:r>
     </w:p>
     <w:p/>
+    <w:p/>
+    <w:p>
+      <w:pPr>
+        <w:rPr>
+          <w:b/>
+          <w:bCs/>
+          <w:sz w:val="24"/>
+          <w:szCs w:val="24"/>
+        </w:rPr>
+      </w:pPr>
+      <w:r>
+        <w:rPr>
+          <w:b/>
+          <w:bCs/>
+          <w:sz w:val="24"/>
+          <w:szCs w:val="24"/>
+        </w:rPr>
+        <w:t xml:space="preserve">Items: </w:t>
+      </w:r>
+    </w:p>
+    <w:p>
+      <w:pPr>
+        <w:pStyle w:val="Prrafodelista"/>
+        <w:numPr>
+          <w:ilvl w:val="0"/>
+          <w:numId w:val="6"/>
+        </w:numPr>
+      </w:pPr>
+      <w:r>
+        <w:rPr>
+          <w:b/>
+          <w:bCs/>
+        </w:rPr>
+        <w:t>Manzana:</w:t>
+      </w:r>
+      <w:r>
+        <w:t xml:space="preserve"> Solo se puede consumir si el jugador no tiene el máximo de 5 corazones de vida.</w:t>
+      </w:r>
+    </w:p>
+    <w:p>
+      <w:pPr>
+        <w:pStyle w:val="Prrafodelista"/>
+        <w:numPr>
+          <w:ilvl w:val="0"/>
+          <w:numId w:val="6"/>
+        </w:numPr>
+      </w:pPr>
+      <w:r>
+        <w:rPr>
+          <w:b/>
+          <w:bCs/>
+        </w:rPr>
+        <w:t>Flechas:</w:t>
+      </w:r>
+      <w:r>
+        <w:t xml:space="preserve"> El jugador puede llevar un máximo de 20 flechas a la vez.</w:t>
+      </w:r>
+      <w:r>
+        <w:t xml:space="preserve"> Tiene un cooldown de 1 segundo. Cada golpe de una flecha quita un punto de vida del enemigo.</w:t>
+      </w:r>
+    </w:p>
+    <w:p/>
+    <w:p/>
+    <w:p/>
+    <w:p/>
+    <w:p/>
     <w:p>
       <w:pPr>
         <w:rPr>
@@ -367,6 +379,25 @@
           <w:szCs w:val="26"/>
         </w:rPr>
         <w:t>Enemigos:</w:t>
+      </w:r>
+    </w:p>
+    <w:p>
+      <w:pPr>
+        <w:rPr>
+          <w:b/>
+          <w:bCs/>
+          <w:sz w:val="26"/>
+          <w:szCs w:val="26"/>
+        </w:rPr>
+      </w:pPr>
+      <w:r>
+        <w:rPr>
+          <w:b/>
+          <w:bCs/>
+          <w:sz w:val="26"/>
+          <w:szCs w:val="26"/>
+        </w:rPr>
+        <w:t>Cada enemigo le saca al jugador un punto de vida por golpe.</w:t>
       </w:r>
     </w:p>
     <w:p>
@@ -386,6 +417,9 @@
       <w:r>
         <w:t xml:space="preserve"> el más común de encontrar, persiguen al jugador si este se acerca mucho a su línea de visión. Mueren de un solo disparo con la ballesta. Aunque sean fáciles de eliminar y sean lentos, aparecen en grupos.</w:t>
       </w:r>
+      <w:r>
+        <w:t xml:space="preserve"> Tiene 3 puntos de vida.</w:t>
+      </w:r>
     </w:p>
     <w:p>
       <w:pPr>
@@ -406,17 +440,8 @@
           <w:b/>
           <w:bCs/>
         </w:rPr>
-        <w:t xml:space="preserve"> - </w:t>
-      </w:r>
-      <w:proofErr w:type="spellStart"/>
-      <w:r>
-        <w:rPr>
-          <w:b/>
-          <w:bCs/>
-        </w:rPr>
-        <w:t>Zombie</w:t>
-      </w:r>
-      <w:proofErr w:type="spellEnd"/>
+        <w:t xml:space="preserve"> - Zombie</w:t>
+      </w:r>
       <w:r>
         <w:rPr>
           <w:b/>
@@ -426,6 +451,9 @@
       </w:r>
       <w:r>
         <w:t xml:space="preserve"> Mucho más fuertes y aparecen con menos frecuencia. Mueren de cinco disparos, aparecen en grupos de entre 1 a 3.</w:t>
+      </w:r>
+      <w:r>
+        <w:t xml:space="preserve"> Tienen 5 puntos de vida.</w:t>
       </w:r>
     </w:p>
     <w:p>
@@ -447,15 +475,29 @@
         <w:t xml:space="preserve">Ogro - Enemigo 3: </w:t>
       </w:r>
       <w:r>
-        <w:t>Un tipo de jefe que aparece a partir del nivel 3 del juego.</w:t>
+        <w:t>Un tipo de jefe que aparece a partir del nivel 3 del juego</w:t>
+      </w:r>
+      <w:r>
+        <w:t>, ataca al jugador disparándole sus propias flechas</w:t>
+      </w:r>
+      <w:r>
+        <w:t>.</w:t>
+      </w:r>
+      <w:r>
+        <w:t xml:space="preserve"> Si el jugador está muy cerca dará una pisoteada, esta es lenta y se da una señal de advertencia para que el jugador pueda esquivarla.</w:t>
+      </w:r>
+      <w:r>
+        <w:t xml:space="preserve"> Tienen 10 puntos de vida.</w:t>
       </w:r>
     </w:p>
     <w:p/>
     <w:p/>
     <w:p>
       <w:r>
-        <w:lastRenderedPageBreak/>
         <w:t>En cada nivel se podrán encontrar cofres que el jugador puede abrir, en este caso se le dan diferentes recompensas aleatorias.</w:t>
+      </w:r>
+      <w:r>
+        <w:t xml:space="preserve"> Los cofres se abren simplemente con acercarse lo suficiente a ellos como para interactuar con su hitbox. Lo mismo sucede al interactuar con llaves u otros objetos.</w:t>
       </w:r>
     </w:p>
     <w:p/>
@@ -513,6 +555,9 @@
       <w:r>
         <w:t xml:space="preserve"> Restaura un corazón de vida.</w:t>
       </w:r>
+      <w:r>
+        <w:t xml:space="preserve"> Este objeto en lo mismo que comida.</w:t>
+      </w:r>
     </w:p>
     <w:p>
       <w:pPr>
@@ -548,6 +593,76 @@
       </w:r>
       <w:r>
         <w:t xml:space="preserve"> Al liberarla, indicará la dirección de las llaves restantes. Si el jugador tiene las tres llaves, indicará donde está la puerta del siguiente nivel.</w:t>
+      </w:r>
+    </w:p>
+    <w:p>
+      <w:pPr>
+        <w:numPr>
+          <w:ilvl w:val="0"/>
+          <w:numId w:val="4"/>
+        </w:numPr>
+      </w:pPr>
+      <w:r>
+        <w:rPr>
+          <w:b/>
+          <w:bCs/>
+        </w:rPr>
+        <w:t>Marco de corazón:</w:t>
+      </w:r>
+      <w:r>
+        <w:t xml:space="preserve"> Sube los puntos de vida por 1.</w:t>
+      </w:r>
+    </w:p>
+    <w:p>
+      <w:pPr>
+        <w:ind w:left="720"/>
+      </w:pPr>
+    </w:p>
+    <w:p>
+      <w:pPr>
+        <w:rPr>
+          <w:b/>
+          <w:bCs/>
+        </w:rPr>
+      </w:pPr>
+      <w:r>
+        <w:rPr>
+          <w:b/>
+          <w:bCs/>
+          <w:sz w:val="24"/>
+          <w:szCs w:val="24"/>
+        </w:rPr>
+        <w:t>Condición de derrota:</w:t>
+      </w:r>
+    </w:p>
+    <w:p>
+      <w:r>
+        <w:t>Quedarse sin puntos de vida resultan en un game over para el jugador. Cuando esto sucede se le da la oportunidad de volver a empezar desde el principio del juego.</w:t>
+      </w:r>
+    </w:p>
+    <w:p/>
+    <w:p>
+      <w:pPr>
+        <w:rPr>
+          <w:b/>
+          <w:bCs/>
+          <w:sz w:val="24"/>
+          <w:szCs w:val="24"/>
+        </w:rPr>
+      </w:pPr>
+      <w:r>
+        <w:rPr>
+          <w:b/>
+          <w:bCs/>
+          <w:sz w:val="24"/>
+          <w:szCs w:val="24"/>
+        </w:rPr>
+        <w:t>Condición de victoria:</w:t>
+      </w:r>
+    </w:p>
+    <w:p>
+      <w:r>
+        <w:t>Para ganar se deben terminar los 5 niveles del juego recolectando las llaves de los respectivos niveles. La cantidad de puntos son un incentivo para que el jugador quiera explorar más el mapa.</w:t>
       </w:r>
     </w:p>
     <w:p/>
@@ -1130,6 +1245,119 @@
       </w:rPr>
     </w:lvl>
   </w:abstractNum>
+  <w:abstractNum w:abstractNumId="5" w15:restartNumberingAfterBreak="0">
+    <w:nsid w:val="79F92054"/>
+    <w:multiLevelType w:val="hybridMultilevel"/>
+    <w:tmpl w:val="D8421432"/>
+    <w:lvl w:ilvl="0" w:tplc="2C0A0001">
+      <w:start w:val="1"/>
+      <w:numFmt w:val="bullet"/>
+      <w:lvlText w:val=""/>
+      <w:lvlJc w:val="left"/>
+      <w:pPr>
+        <w:ind w:left="720" w:hanging="360"/>
+      </w:pPr>
+      <w:rPr>
+        <w:rFonts w:ascii="Symbol" w:hAnsi="Symbol" w:hint="default"/>
+      </w:rPr>
+    </w:lvl>
+    <w:lvl w:ilvl="1" w:tplc="2C0A0003" w:tentative="1">
+      <w:start w:val="1"/>
+      <w:numFmt w:val="bullet"/>
+      <w:lvlText w:val="o"/>
+      <w:lvlJc w:val="left"/>
+      <w:pPr>
+        <w:ind w:left="1440" w:hanging="360"/>
+      </w:pPr>
+      <w:rPr>
+        <w:rFonts w:ascii="Courier New" w:hAnsi="Courier New" w:cs="Courier New" w:hint="default"/>
+      </w:rPr>
+    </w:lvl>
+    <w:lvl w:ilvl="2" w:tplc="2C0A0005" w:tentative="1">
+      <w:start w:val="1"/>
+      <w:numFmt w:val="bullet"/>
+      <w:lvlText w:val=""/>
+      <w:lvlJc w:val="left"/>
+      <w:pPr>
+        <w:ind w:left="2160" w:hanging="360"/>
+      </w:pPr>
+      <w:rPr>
+        <w:rFonts w:ascii="Wingdings" w:hAnsi="Wingdings" w:hint="default"/>
+      </w:rPr>
+    </w:lvl>
+    <w:lvl w:ilvl="3" w:tplc="2C0A0001" w:tentative="1">
+      <w:start w:val="1"/>
+      <w:numFmt w:val="bullet"/>
+      <w:lvlText w:val=""/>
+      <w:lvlJc w:val="left"/>
+      <w:pPr>
+        <w:ind w:left="2880" w:hanging="360"/>
+      </w:pPr>
+      <w:rPr>
+        <w:rFonts w:ascii="Symbol" w:hAnsi="Symbol" w:hint="default"/>
+      </w:rPr>
+    </w:lvl>
+    <w:lvl w:ilvl="4" w:tplc="2C0A0003" w:tentative="1">
+      <w:start w:val="1"/>
+      <w:numFmt w:val="bullet"/>
+      <w:lvlText w:val="o"/>
+      <w:lvlJc w:val="left"/>
+      <w:pPr>
+        <w:ind w:left="3600" w:hanging="360"/>
+      </w:pPr>
+      <w:rPr>
+        <w:rFonts w:ascii="Courier New" w:hAnsi="Courier New" w:cs="Courier New" w:hint="default"/>
+      </w:rPr>
+    </w:lvl>
+    <w:lvl w:ilvl="5" w:tplc="2C0A0005" w:tentative="1">
+      <w:start w:val="1"/>
+      <w:numFmt w:val="bullet"/>
+      <w:lvlText w:val=""/>
+      <w:lvlJc w:val="left"/>
+      <w:pPr>
+        <w:ind w:left="4320" w:hanging="360"/>
+      </w:pPr>
+      <w:rPr>
+        <w:rFonts w:ascii="Wingdings" w:hAnsi="Wingdings" w:hint="default"/>
+      </w:rPr>
+    </w:lvl>
+    <w:lvl w:ilvl="6" w:tplc="2C0A0001" w:tentative="1">
+      <w:start w:val="1"/>
+      <w:numFmt w:val="bullet"/>
+      <w:lvlText w:val=""/>
+      <w:lvlJc w:val="left"/>
+      <w:pPr>
+        <w:ind w:left="5040" w:hanging="360"/>
+      </w:pPr>
+      <w:rPr>
+        <w:rFonts w:ascii="Symbol" w:hAnsi="Symbol" w:hint="default"/>
+      </w:rPr>
+    </w:lvl>
+    <w:lvl w:ilvl="7" w:tplc="2C0A0003" w:tentative="1">
+      <w:start w:val="1"/>
+      <w:numFmt w:val="bullet"/>
+      <w:lvlText w:val="o"/>
+      <w:lvlJc w:val="left"/>
+      <w:pPr>
+        <w:ind w:left="5760" w:hanging="360"/>
+      </w:pPr>
+      <w:rPr>
+        <w:rFonts w:ascii="Courier New" w:hAnsi="Courier New" w:cs="Courier New" w:hint="default"/>
+      </w:rPr>
+    </w:lvl>
+    <w:lvl w:ilvl="8" w:tplc="2C0A0005" w:tentative="1">
+      <w:start w:val="1"/>
+      <w:numFmt w:val="bullet"/>
+      <w:lvlText w:val=""/>
+      <w:lvlJc w:val="left"/>
+      <w:pPr>
+        <w:ind w:left="6480" w:hanging="360"/>
+      </w:pPr>
+      <w:rPr>
+        <w:rFonts w:ascii="Wingdings" w:hAnsi="Wingdings" w:hint="default"/>
+      </w:rPr>
+    </w:lvl>
+  </w:abstractNum>
   <w:num w:numId="1" w16cid:durableId="2102027952">
     <w:abstractNumId w:val="3"/>
   </w:num>
@@ -1144,6 +1372,9 @@
   </w:num>
   <w:num w:numId="5" w16cid:durableId="195436122">
     <w:abstractNumId w:val="1"/>
+  </w:num>
+  <w:num w:numId="6" w16cid:durableId="523633179">
+    <w:abstractNumId w:val="5"/>
   </w:num>
 </w:numbering>
 </file>
@@ -1732,6 +1963,17 @@
       <w:szCs w:val="30"/>
     </w:rPr>
   </w:style>
+  <w:style w:type="paragraph" w:styleId="Prrafodelista">
+    <w:name w:val="List Paragraph"/>
+    <w:basedOn w:val="Normal"/>
+    <w:uiPriority w:val="34"/>
+    <w:qFormat/>
+    <w:rsid w:val="009C34EB"/>
+    <w:pPr>
+      <w:ind w:left="720"/>
+      <w:contextualSpacing/>
+    </w:pPr>
+  </w:style>
 </w:styles>
 </file>
 

</xml_diff>